<commit_message>
refactor screen verify para que muestre datos personalizados (incompleto)
</commit_message>
<xml_diff>
--- a/templates/PDD.docx
+++ b/templates/PDD.docx
@@ -677,9 +677,8 @@
                 <w:szCs w:val="20"/>
                 <w:lang w:val="en-US"/>
               </w:rPr>
-              <w:t xml:space="preserve">{%tr </w:t>
-            </w:r>
-            <w:proofErr w:type="spellStart"/>
+              <w:t xml:space="preserve">{%tr for </w:t>
+            </w:r>
             <w:r>
               <w:rPr>
                 <w:rFonts w:cs="Segoe UI"/>
@@ -687,7 +686,7 @@
                 <w:szCs w:val="20"/>
                 <w:lang w:val="en-US"/>
               </w:rPr>
-              <w:t xml:space="preserve">for </w:t>
+              <w:t>m</w:t>
             </w:r>
             <w:r>
               <w:rPr>
@@ -696,9 +695,8 @@
                 <w:szCs w:val="20"/>
                 <w:lang w:val="en-US"/>
               </w:rPr>
-              <w:t>m</w:t>
-            </w:r>
-            <w:proofErr w:type="spellEnd"/>
+              <w:t xml:space="preserve"> in </w:t>
+            </w:r>
             <w:r>
               <w:rPr>
                 <w:rFonts w:cs="Segoe UI"/>
@@ -706,19 +704,8 @@
                 <w:szCs w:val="20"/>
                 <w:lang w:val="en-US"/>
               </w:rPr>
-              <w:t xml:space="preserve"> in </w:t>
-            </w:r>
-            <w:proofErr w:type="spellStart"/>
-            <w:r>
-              <w:rPr>
-                <w:rFonts w:cs="Segoe UI"/>
-                <w:sz w:val="20"/>
-                <w:szCs w:val="20"/>
-                <w:lang w:val="en-US"/>
-              </w:rPr>
               <w:t>modificaciones</w:t>
             </w:r>
-            <w:proofErr w:type="spellEnd"/>
             <w:r>
               <w:rPr>
                 <w:rFonts w:cs="Segoe UI"/>
@@ -863,25 +850,7 @@
                 <w:sz w:val="20"/>
                 <w:szCs w:val="20"/>
               </w:rPr>
-              <w:t>{{</w:t>
-            </w:r>
-            <w:proofErr w:type="spellStart"/>
-            <w:r>
-              <w:rPr>
-                <w:rFonts w:cs="Segoe UI"/>
-                <w:sz w:val="20"/>
-                <w:szCs w:val="20"/>
-              </w:rPr>
-              <w:t>m.version</w:t>
-            </w:r>
-            <w:proofErr w:type="spellEnd"/>
-            <w:r>
-              <w:rPr>
-                <w:rFonts w:cs="Segoe UI"/>
-                <w:sz w:val="20"/>
-                <w:szCs w:val="20"/>
-              </w:rPr>
-              <w:t>}}</w:t>
+              <w:t>{{m.version}}</w:t>
             </w:r>
           </w:p>
         </w:tc>
@@ -913,7 +882,6 @@
               </w:rPr>
               <w:t>{{</w:t>
             </w:r>
-            <w:proofErr w:type="spellStart"/>
             <w:r>
               <w:rPr>
                 <w:rFonts w:cs="Segoe UI"/>
@@ -921,9 +889,8 @@
                 <w:szCs w:val="20"/>
                 <w:lang w:val="es-ES"/>
               </w:rPr>
-              <w:t>m.fecha</w:t>
-            </w:r>
-            <w:proofErr w:type="spellEnd"/>
+              <w:t>m.</w:t>
+            </w:r>
             <w:r>
               <w:rPr>
                 <w:rFonts w:cs="Segoe UI"/>
@@ -931,7 +898,7 @@
                 <w:szCs w:val="20"/>
                 <w:lang w:val="es-ES"/>
               </w:rPr>
-              <w:t>}}</w:t>
+              <w:t>fecha}}</w:t>
             </w:r>
           </w:p>
         </w:tc>
@@ -961,27 +928,7 @@
                 <w:szCs w:val="20"/>
                 <w:lang w:val="es-ES"/>
               </w:rPr>
-              <w:t>{{</w:t>
-            </w:r>
-            <w:proofErr w:type="spellStart"/>
-            <w:r>
-              <w:rPr>
-                <w:rFonts w:cs="Segoe UI"/>
-                <w:sz w:val="20"/>
-                <w:szCs w:val="20"/>
-                <w:lang w:val="es-ES"/>
-              </w:rPr>
-              <w:t>m.paginas</w:t>
-            </w:r>
-            <w:proofErr w:type="spellEnd"/>
-            <w:r>
-              <w:rPr>
-                <w:rFonts w:cs="Segoe UI"/>
-                <w:sz w:val="20"/>
-                <w:szCs w:val="20"/>
-                <w:lang w:val="es-ES"/>
-              </w:rPr>
-              <w:t>}}</w:t>
+              <w:t>{{m.paginas}}</w:t>
             </w:r>
           </w:p>
         </w:tc>
@@ -1011,27 +958,7 @@
                 <w:szCs w:val="20"/>
                 <w:lang w:val="es-ES"/>
               </w:rPr>
-              <w:t>{{</w:t>
-            </w:r>
-            <w:proofErr w:type="spellStart"/>
-            <w:r>
-              <w:rPr>
-                <w:rFonts w:cs="Segoe UI"/>
-                <w:sz w:val="20"/>
-                <w:szCs w:val="20"/>
-                <w:lang w:val="es-ES"/>
-              </w:rPr>
-              <w:t>m.motivo</w:t>
-            </w:r>
-            <w:proofErr w:type="spellEnd"/>
-            <w:r>
-              <w:rPr>
-                <w:rFonts w:cs="Segoe UI"/>
-                <w:sz w:val="20"/>
-                <w:szCs w:val="20"/>
-                <w:lang w:val="es-ES"/>
-              </w:rPr>
-              <w:t>}}</w:t>
+              <w:t>{{m.motivo}}</w:t>
             </w:r>
           </w:p>
         </w:tc>
@@ -1061,27 +988,7 @@
                 <w:szCs w:val="20"/>
                 <w:lang w:val="es-ES"/>
               </w:rPr>
-              <w:t>{{</w:t>
-            </w:r>
-            <w:proofErr w:type="spellStart"/>
-            <w:r>
-              <w:rPr>
-                <w:rFonts w:cs="Segoe UI"/>
-                <w:sz w:val="20"/>
-                <w:szCs w:val="20"/>
-                <w:lang w:val="es-ES"/>
-              </w:rPr>
-              <w:t>m.autor</w:t>
-            </w:r>
-            <w:proofErr w:type="spellEnd"/>
-            <w:r>
-              <w:rPr>
-                <w:rFonts w:cs="Segoe UI"/>
-                <w:sz w:val="20"/>
-                <w:szCs w:val="20"/>
-                <w:lang w:val="es-ES"/>
-              </w:rPr>
-              <w:t>}}</w:t>
+              <w:t>{{m.autor}}</w:t>
             </w:r>
           </w:p>
         </w:tc>
@@ -1109,26 +1016,16 @@
                 <w:sz w:val="20"/>
                 <w:szCs w:val="20"/>
               </w:rPr>
-              <w:t>{{</w:t>
-            </w:r>
-            <w:proofErr w:type="spellStart"/>
+              <w:t>{{m.</w:t>
+            </w:r>
             <w:r>
               <w:rPr>
                 <w:rFonts w:cs="Segoe UI"/>
                 <w:sz w:val="20"/>
                 <w:szCs w:val="20"/>
               </w:rPr>
-              <w:t>m.</w:t>
-            </w:r>
-            <w:r>
-              <w:rPr>
-                <w:rFonts w:cs="Segoe UI"/>
-                <w:sz w:val="20"/>
-                <w:szCs w:val="20"/>
-              </w:rPr>
               <w:t>sector</w:t>
             </w:r>
-            <w:proofErr w:type="spellEnd"/>
             <w:r>
               <w:rPr>
                 <w:rFonts w:cs="Segoe UI"/>
@@ -1170,7 +1067,6 @@
               </w:rPr>
               <w:t>{%</w:t>
             </w:r>
-            <w:proofErr w:type="spellStart"/>
             <w:r>
               <w:rPr>
                 <w:rFonts w:cs="Segoe UI"/>
@@ -1179,7 +1075,6 @@
               </w:rPr>
               <w:t>tr</w:t>
             </w:r>
-            <w:proofErr w:type="spellEnd"/>
             <w:r>
               <w:rPr>
                 <w:rFonts w:cs="Segoe UI"/>
@@ -2377,25 +2272,7 @@
                 <w:sz w:val="20"/>
                 <w:szCs w:val="20"/>
               </w:rPr>
-              <w:t>{{</w:t>
-            </w:r>
-            <w:proofErr w:type="spellStart"/>
-            <w:r>
-              <w:rPr>
-                <w:rFonts w:cs="Segoe UI"/>
-                <w:sz w:val="20"/>
-                <w:szCs w:val="20"/>
-              </w:rPr>
-              <w:t>r.version</w:t>
-            </w:r>
-            <w:proofErr w:type="spellEnd"/>
-            <w:r>
-              <w:rPr>
-                <w:rFonts w:cs="Segoe UI"/>
-                <w:sz w:val="20"/>
-                <w:szCs w:val="20"/>
-              </w:rPr>
-              <w:t>}}</w:t>
+              <w:t>{{r.version}}</w:t>
             </w:r>
           </w:p>
         </w:tc>
@@ -2425,7 +2302,6 @@
               </w:rPr>
               <w:t>{{</w:t>
             </w:r>
-            <w:proofErr w:type="spellStart"/>
             <w:r>
               <w:rPr>
                 <w:rFonts w:cs="Segoe UI"/>
@@ -2433,9 +2309,8 @@
                 <w:szCs w:val="20"/>
                 <w:lang w:val="es-ES"/>
               </w:rPr>
-              <w:t>r.fecha</w:t>
-            </w:r>
-            <w:proofErr w:type="spellEnd"/>
+              <w:t>r.</w:t>
+            </w:r>
             <w:r>
               <w:rPr>
                 <w:rFonts w:cs="Segoe UI"/>
@@ -2443,7 +2318,7 @@
                 <w:szCs w:val="20"/>
                 <w:lang w:val="es-ES"/>
               </w:rPr>
-              <w:t>}}</w:t>
+              <w:t>fecha}}</w:t>
             </w:r>
           </w:p>
         </w:tc>
@@ -2471,9 +2346,8 @@
                 <w:szCs w:val="20"/>
                 <w:lang w:val="es-ES"/>
               </w:rPr>
-              <w:t>{{</w:t>
-            </w:r>
-            <w:proofErr w:type="spellStart"/>
+              <w:t>{{r.</w:t>
+            </w:r>
             <w:r>
               <w:rPr>
                 <w:rFonts w:cs="Segoe UI"/>
@@ -2481,18 +2355,8 @@
                 <w:szCs w:val="20"/>
                 <w:lang w:val="es-ES"/>
               </w:rPr>
-              <w:t>r.</w:t>
-            </w:r>
-            <w:r>
-              <w:rPr>
-                <w:rFonts w:cs="Segoe UI"/>
-                <w:sz w:val="20"/>
-                <w:szCs w:val="20"/>
-                <w:lang w:val="es-ES"/>
-              </w:rPr>
               <w:t>aprobador</w:t>
             </w:r>
-            <w:proofErr w:type="spellEnd"/>
             <w:r>
               <w:rPr>
                 <w:rFonts w:cs="Segoe UI"/>
@@ -2528,9 +2392,8 @@
                 <w:szCs w:val="20"/>
                 <w:lang w:val="es-ES"/>
               </w:rPr>
-              <w:t>{{</w:t>
-            </w:r>
-            <w:proofErr w:type="spellStart"/>
+              <w:t>{{r.</w:t>
+            </w:r>
             <w:r>
               <w:rPr>
                 <w:rFonts w:cs="Segoe UI"/>
@@ -2538,18 +2401,8 @@
                 <w:szCs w:val="20"/>
                 <w:lang w:val="es-ES"/>
               </w:rPr>
-              <w:t>r.</w:t>
-            </w:r>
-            <w:r>
-              <w:rPr>
-                <w:rFonts w:cs="Segoe UI"/>
-                <w:sz w:val="20"/>
-                <w:szCs w:val="20"/>
-                <w:lang w:val="es-ES"/>
-              </w:rPr>
               <w:t>comentarios</w:t>
             </w:r>
-            <w:proofErr w:type="spellEnd"/>
             <w:r>
               <w:rPr>
                 <w:rFonts w:cs="Segoe UI"/>
@@ -2590,7 +2443,6 @@
               </w:rPr>
               <w:t>{%</w:t>
             </w:r>
-            <w:proofErr w:type="spellStart"/>
             <w:r>
               <w:rPr>
                 <w:rFonts w:cs="Segoe UI"/>
@@ -2599,7 +2451,6 @@
               </w:rPr>
               <w:t>tr</w:t>
             </w:r>
-            <w:proofErr w:type="spellEnd"/>
             <w:r>
               <w:rPr>
                 <w:rFonts w:cs="Segoe UI"/>
@@ -2977,16 +2828,8 @@
             <w:rPr>
               <w:lang w:val="es-AR"/>
             </w:rPr>
-            <w:t xml:space="preserve">| </w:t>
+            <w:t>| Contents</w:t>
           </w:r>
-          <w:proofErr w:type="spellStart"/>
-          <w:r>
-            <w:rPr>
-              <w:lang w:val="es-AR"/>
-            </w:rPr>
-            <w:t>Contents</w:t>
-          </w:r>
-          <w:proofErr w:type="spellEnd"/>
         </w:p>
         <w:p>
           <w:pPr>
@@ -4593,14 +4436,18 @@
         </w:rPr>
         <w:t xml:space="preserve">r </w:t>
       </w:r>
-      <w:proofErr w:type="spellStart"/>
       <w:r>
         <w:rPr>
           <w:color w:val="7E7E7E"/>
         </w:rPr>
         <w:t>propositoProceso</w:t>
       </w:r>
-      <w:proofErr w:type="spellEnd"/>
+      <w:r>
+        <w:rPr>
+          <w:color w:val="7E7E7E"/>
+        </w:rPr>
+        <w:t xml:space="preserve"> </w:t>
+      </w:r>
       <w:r>
         <w:rPr>
           <w:color w:val="7E7E7E"/>
@@ -4659,7 +4506,37 @@
         <w:rPr>
           <w:noProof/>
         </w:rPr>
-        <w:t>{{diagramaHighLevel}}</w:t>
+        <w:t>{{</w:t>
+      </w:r>
+      <w:r>
+        <w:rPr>
+          <w:noProof/>
+        </w:rPr>
+        <w:t xml:space="preserve"> </w:t>
+      </w:r>
+      <w:r>
+        <w:rPr>
+          <w:noProof/>
+        </w:rPr>
+        <w:t>diagrama</w:t>
+      </w:r>
+      <w:r>
+        <w:rPr>
+          <w:noProof/>
+        </w:rPr>
+        <w:t>AltoNivel</w:t>
+      </w:r>
+      <w:r>
+        <w:rPr>
+          <w:noProof/>
+        </w:rPr>
+        <w:t xml:space="preserve"> </w:t>
+      </w:r>
+      <w:r>
+        <w:rPr>
+          <w:noProof/>
+        </w:rPr>
+        <w:t>}}</w:t>
       </w:r>
     </w:p>
     <w:p>
@@ -4694,7 +4571,37 @@
         <w:rPr>
           <w:noProof/>
         </w:rPr>
-        <w:t>{{diagramaLowLevel}}</w:t>
+        <w:t>{{</w:t>
+      </w:r>
+      <w:r>
+        <w:rPr>
+          <w:noProof/>
+        </w:rPr>
+        <w:t xml:space="preserve"> </w:t>
+      </w:r>
+      <w:r>
+        <w:rPr>
+          <w:noProof/>
+        </w:rPr>
+        <w:t>diagrama</w:t>
+      </w:r>
+      <w:r>
+        <w:rPr>
+          <w:noProof/>
+        </w:rPr>
+        <w:t>BajoNivel</w:t>
+      </w:r>
+      <w:r>
+        <w:rPr>
+          <w:noProof/>
+        </w:rPr>
+        <w:t xml:space="preserve"> </w:t>
+      </w:r>
+      <w:r>
+        <w:rPr>
+          <w:noProof/>
+        </w:rPr>
+        <w:t>}}</w:t>
       </w:r>
     </w:p>
     <w:p>
@@ -5191,25 +5098,7 @@
                 <w:sz w:val="18"/>
                 <w:szCs w:val="18"/>
               </w:rPr>
-              <w:t>{{</w:t>
-            </w:r>
-            <w:proofErr w:type="spellStart"/>
-            <w:r>
-              <w:rPr>
-                <w:rFonts w:cs="Segoe UI"/>
-                <w:sz w:val="18"/>
-                <w:szCs w:val="18"/>
-              </w:rPr>
-              <w:t>carpetaCompartida</w:t>
-            </w:r>
-            <w:proofErr w:type="spellEnd"/>
-            <w:r>
-              <w:rPr>
-                <w:rFonts w:cs="Segoe UI"/>
-                <w:sz w:val="18"/>
-                <w:szCs w:val="18"/>
-              </w:rPr>
-              <w:t>}}</w:t>
+              <w:t>{{carpetaCompartida}}</w:t>
             </w:r>
           </w:p>
         </w:tc>
@@ -5288,25 +5177,7 @@
                 <w:sz w:val="18"/>
                 <w:szCs w:val="18"/>
               </w:rPr>
-              <w:t>{{</w:t>
-            </w:r>
-            <w:proofErr w:type="spellStart"/>
-            <w:r>
-              <w:rPr>
-                <w:rFonts w:cs="Segoe UI"/>
-                <w:sz w:val="18"/>
-                <w:szCs w:val="18"/>
-              </w:rPr>
-              <w:t>carpetaOutput</w:t>
-            </w:r>
-            <w:proofErr w:type="spellEnd"/>
-            <w:r>
-              <w:rPr>
-                <w:rFonts w:cs="Segoe UI"/>
-                <w:sz w:val="18"/>
-                <w:szCs w:val="18"/>
-              </w:rPr>
-              <w:t>}}</w:t>
+              <w:t>{{carpetaOutput}}</w:t>
             </w:r>
           </w:p>
         </w:tc>
@@ -5393,25 +5264,7 @@
                 <w:sz w:val="18"/>
                 <w:szCs w:val="18"/>
               </w:rPr>
-              <w:t>{{</w:t>
-            </w:r>
-            <w:proofErr w:type="spellStart"/>
-            <w:r>
-              <w:rPr>
-                <w:rFonts w:cs="Segoe UI"/>
-                <w:sz w:val="18"/>
-                <w:szCs w:val="18"/>
-              </w:rPr>
-              <w:t>carpetaInput</w:t>
-            </w:r>
-            <w:proofErr w:type="spellEnd"/>
-            <w:r>
-              <w:rPr>
-                <w:rFonts w:cs="Segoe UI"/>
-                <w:sz w:val="18"/>
-                <w:szCs w:val="18"/>
-              </w:rPr>
-              <w:t>}}</w:t>
+              <w:t>{{carpetaInput}}</w:t>
             </w:r>
           </w:p>
         </w:tc>
@@ -5673,16 +5526,15 @@
                 <w:sz w:val="18"/>
                 <w:szCs w:val="18"/>
               </w:rPr>
-              <w:t>{{</w:t>
-            </w:r>
-            <w:proofErr w:type="spellStart"/>
+              <w:t>{{ejecuci</w:t>
+            </w:r>
             <w:r>
               <w:rPr>
                 <w:rFonts w:cs="Segoe UI"/>
                 <w:sz w:val="18"/>
                 <w:szCs w:val="18"/>
               </w:rPr>
-              <w:t>ejecuci</w:t>
+              <w:t>o</w:t>
             </w:r>
             <w:r>
               <w:rPr>
@@ -5690,24 +5542,7 @@
                 <w:sz w:val="18"/>
                 <w:szCs w:val="18"/>
               </w:rPr>
-              <w:t>o</w:t>
-            </w:r>
-            <w:r>
-              <w:rPr>
-                <w:rFonts w:cs="Segoe UI"/>
-                <w:sz w:val="18"/>
-                <w:szCs w:val="18"/>
-              </w:rPr>
-              <w:t>n</w:t>
-            </w:r>
-            <w:proofErr w:type="spellEnd"/>
-            <w:r>
-              <w:rPr>
-                <w:rFonts w:cs="Segoe UI"/>
-                <w:sz w:val="18"/>
-                <w:szCs w:val="18"/>
-              </w:rPr>
-              <w:t>}}</w:t>
+              <w:t>n}}</w:t>
             </w:r>
           </w:p>
         </w:tc>
@@ -5771,35 +5606,7 @@
         <w:rPr>
           <w:lang w:val="en-US" w:eastAsia="en-US"/>
         </w:rPr>
-        <w:t xml:space="preserve">{%p for </w:t>
-      </w:r>
-      <w:proofErr w:type="spellStart"/>
-      <w:r>
-        <w:rPr>
-          <w:lang w:val="en-US" w:eastAsia="en-US"/>
-        </w:rPr>
-        <w:t>fase</w:t>
-      </w:r>
-      <w:proofErr w:type="spellEnd"/>
-      <w:r>
-        <w:rPr>
-          <w:lang w:val="en-US" w:eastAsia="en-US"/>
-        </w:rPr>
-        <w:t xml:space="preserve"> in </w:t>
-      </w:r>
-      <w:proofErr w:type="spellStart"/>
-      <w:r>
-        <w:rPr>
-          <w:lang w:val="en-US" w:eastAsia="en-US"/>
-        </w:rPr>
-        <w:t>fases</w:t>
-      </w:r>
-      <w:proofErr w:type="spellEnd"/>
-      <w:r>
-        <w:rPr>
-          <w:lang w:val="en-US" w:eastAsia="en-US"/>
-        </w:rPr>
-        <w:t xml:space="preserve"> %}</w:t>
+        <w:t>{%p for fase in fases %}</w:t>
       </w:r>
     </w:p>
     <w:p>
@@ -5818,21 +5625,7 @@
         <w:rPr>
           <w:lang w:eastAsia="en-US"/>
         </w:rPr>
-        <w:t>{{</w:t>
-      </w:r>
-      <w:proofErr w:type="spellStart"/>
-      <w:r>
-        <w:rPr>
-          <w:lang w:eastAsia="en-US"/>
-        </w:rPr>
-        <w:t>fase.tituloFase</w:t>
-      </w:r>
-      <w:proofErr w:type="spellEnd"/>
-      <w:r>
-        <w:rPr>
-          <w:lang w:eastAsia="en-US"/>
-        </w:rPr>
-        <w:t>}}</w:t>
+        <w:t>{{fase.tituloFase}}</w:t>
       </w:r>
     </w:p>
     <w:p>
@@ -6853,61 +6646,7 @@
                 <w:sz w:val="18"/>
                 <w:highlight w:val="yellow"/>
               </w:rPr>
-              <w:t xml:space="preserve">[LINEA ERROR] </w:t>
-            </w:r>
-            <w:proofErr w:type="spellStart"/>
-            <w:r>
-              <w:rPr>
-                <w:color w:val="7E7E7E"/>
-                <w:sz w:val="18"/>
-                <w:highlight w:val="yellow"/>
-              </w:rPr>
-              <w:t>Linea</w:t>
-            </w:r>
-            <w:proofErr w:type="spellEnd"/>
-            <w:r>
-              <w:rPr>
-                <w:color w:val="7E7E7E"/>
-                <w:sz w:val="18"/>
-                <w:highlight w:val="yellow"/>
-              </w:rPr>
-              <w:t xml:space="preserve">: 79 - </w:t>
-            </w:r>
-            <w:proofErr w:type="spellStart"/>
-            <w:r>
-              <w:rPr>
-                <w:color w:val="7E7E7E"/>
-                <w:sz w:val="18"/>
-                <w:highlight w:val="yellow"/>
-              </w:rPr>
-              <w:t>Unable</w:t>
-            </w:r>
-            <w:proofErr w:type="spellEnd"/>
-            <w:r>
-              <w:rPr>
-                <w:color w:val="7E7E7E"/>
-                <w:sz w:val="18"/>
-                <w:highlight w:val="yellow"/>
-              </w:rPr>
-              <w:t xml:space="preserve"> to </w:t>
-            </w:r>
-            <w:proofErr w:type="spellStart"/>
-            <w:r>
-              <w:rPr>
-                <w:color w:val="7E7E7E"/>
-                <w:sz w:val="18"/>
-                <w:highlight w:val="yellow"/>
-              </w:rPr>
-              <w:t>find</w:t>
-            </w:r>
-            <w:proofErr w:type="spellEnd"/>
-            <w:r>
-              <w:rPr>
-                <w:color w:val="7E7E7E"/>
-                <w:sz w:val="18"/>
-                <w:highlight w:val="yellow"/>
-              </w:rPr>
-              <w:t xml:space="preserve"> CLIENT. </w:t>
+              <w:t xml:space="preserve">[LINEA ERROR] Linea: 79 - Unable to find CLIENT. </w:t>
             </w:r>
             <w:r>
               <w:rPr>
@@ -7562,7 +7301,6 @@
               </w:rPr>
               <w:t xml:space="preserve"> in </w:t>
             </w:r>
-            <w:proofErr w:type="spellStart"/>
             <w:r>
               <w:rPr>
                 <w:rFonts w:cs="Segoe UI"/>
@@ -7572,7 +7310,6 @@
               </w:rPr>
               <w:t>excepcionesSys</w:t>
             </w:r>
-            <w:proofErr w:type="spellEnd"/>
             <w:r>
               <w:rPr>
                 <w:rFonts w:cs="Segoe UI"/>
@@ -7655,25 +7392,7 @@
                 <w:szCs w:val="18"/>
                 <w:lang w:val="en-US"/>
               </w:rPr>
-              <w:t>{{</w:t>
-            </w:r>
-            <w:proofErr w:type="spellStart"/>
-            <w:r>
-              <w:rPr>
-                <w:sz w:val="18"/>
-                <w:szCs w:val="18"/>
-                <w:lang w:val="en-US"/>
-              </w:rPr>
-              <w:t>e.escenario</w:t>
-            </w:r>
-            <w:proofErr w:type="spellEnd"/>
-            <w:r>
-              <w:rPr>
-                <w:sz w:val="18"/>
-                <w:szCs w:val="18"/>
-                <w:lang w:val="en-US"/>
-              </w:rPr>
-              <w:t>}}</w:t>
+              <w:t>{{e.escenario}}</w:t>
             </w:r>
           </w:p>
         </w:tc>
@@ -7704,27 +7423,7 @@
                 <w:szCs w:val="18"/>
                 <w:lang w:val="en-US"/>
               </w:rPr>
-              <w:t>{{</w:t>
-            </w:r>
-            <w:proofErr w:type="spellStart"/>
-            <w:r>
-              <w:rPr>
-                <w:rFonts w:cs="Segoe UI"/>
-                <w:sz w:val="18"/>
-                <w:szCs w:val="18"/>
-                <w:lang w:val="en-US"/>
-              </w:rPr>
-              <w:t>e.accion</w:t>
-            </w:r>
-            <w:proofErr w:type="spellEnd"/>
-            <w:r>
-              <w:rPr>
-                <w:rFonts w:cs="Segoe UI"/>
-                <w:sz w:val="18"/>
-                <w:szCs w:val="18"/>
-                <w:lang w:val="en-US"/>
-              </w:rPr>
-              <w:t>}}</w:t>
+              <w:t>{{e.accion}}</w:t>
             </w:r>
           </w:p>
         </w:tc>
@@ -7778,7 +7477,6 @@
               </w:rPr>
               <w:t>{%</w:t>
             </w:r>
-            <w:proofErr w:type="spellStart"/>
             <w:r>
               <w:rPr>
                 <w:rFonts w:cs="Segoe UI"/>
@@ -7787,7 +7485,6 @@
               </w:rPr>
               <w:t>tr</w:t>
             </w:r>
-            <w:proofErr w:type="spellEnd"/>
             <w:r>
               <w:rPr>
                 <w:rFonts w:cs="Segoe UI"/>
@@ -8028,7 +7725,6 @@
               </w:rPr>
               <w:t xml:space="preserve"> in </w:t>
             </w:r>
-            <w:proofErr w:type="spellStart"/>
             <w:r>
               <w:rPr>
                 <w:rFonts w:cs="Segoe UI"/>
@@ -8038,7 +7734,6 @@
               </w:rPr>
               <w:t>excepcionesNeg</w:t>
             </w:r>
-            <w:proofErr w:type="spellEnd"/>
             <w:r>
               <w:rPr>
                 <w:rFonts w:cs="Segoe UI"/>
@@ -8116,23 +7811,7 @@
                 <w:color w:val="7E7E7E"/>
                 <w:sz w:val="18"/>
               </w:rPr>
-              <w:t>{{</w:t>
-            </w:r>
-            <w:proofErr w:type="spellStart"/>
-            <w:r>
-              <w:rPr>
-                <w:color w:val="7E7E7E"/>
-                <w:sz w:val="18"/>
-              </w:rPr>
-              <w:t>e.escenario</w:t>
-            </w:r>
-            <w:proofErr w:type="spellEnd"/>
-            <w:r>
-              <w:rPr>
-                <w:color w:val="7E7E7E"/>
-                <w:sz w:val="18"/>
-              </w:rPr>
-              <w:t>}}</w:t>
+              <w:t>{{e.escenario}}</w:t>
             </w:r>
           </w:p>
         </w:tc>
@@ -8164,25 +7843,7 @@
                 <w:sz w:val="18"/>
                 <w:lang w:val="es-AR"/>
               </w:rPr>
-              <w:t>{{</w:t>
-            </w:r>
-            <w:proofErr w:type="spellStart"/>
-            <w:r>
-              <w:rPr>
-                <w:color w:val="7E7E7E"/>
-                <w:sz w:val="18"/>
-                <w:lang w:val="es-AR"/>
-              </w:rPr>
-              <w:t>e.accion</w:t>
-            </w:r>
-            <w:proofErr w:type="spellEnd"/>
-            <w:r>
-              <w:rPr>
-                <w:color w:val="7E7E7E"/>
-                <w:sz w:val="18"/>
-                <w:lang w:val="es-AR"/>
-              </w:rPr>
-              <w:t>}}</w:t>
+              <w:t>{{e.accion}}</w:t>
             </w:r>
           </w:p>
         </w:tc>
@@ -8233,7 +7894,6 @@
               </w:rPr>
               <w:t>{%</w:t>
             </w:r>
-            <w:proofErr w:type="spellStart"/>
             <w:r>
               <w:rPr>
                 <w:rFonts w:cs="Segoe UI"/>
@@ -8242,7 +7902,6 @@
               </w:rPr>
               <w:t>tr</w:t>
             </w:r>
-            <w:proofErr w:type="spellEnd"/>
             <w:r>
               <w:rPr>
                 <w:rFonts w:cs="Segoe UI"/>
@@ -8622,7 +8281,6 @@
                 <w:lang w:eastAsia="es-ES"/>
               </w:rPr>
             </w:pPr>
-            <w:proofErr w:type="spellStart"/>
             <w:r>
               <w:rPr>
                 <w:rFonts w:ascii="Calibri" w:eastAsia="Times New Roman" w:hAnsi="Calibri" w:cs="Calibri"/>
@@ -8641,31 +8299,8 @@
                 <w:color w:val="FFFFFF"/>
                 <w:lang w:eastAsia="es-ES"/>
               </w:rPr>
-              <w:t>viewed</w:t>
-            </w:r>
-            <w:proofErr w:type="spellEnd"/>
-            <w:r>
-              <w:rPr>
-                <w:rFonts w:ascii="Calibri" w:eastAsia="Times New Roman" w:hAnsi="Calibri" w:cs="Calibri"/>
-                <w:b/>
-                <w:bCs/>
-                <w:color w:val="FFFFFF"/>
-                <w:lang w:eastAsia="es-ES"/>
-              </w:rPr>
-              <w:t xml:space="preserve"> </w:t>
-            </w:r>
-            <w:proofErr w:type="spellStart"/>
-            <w:r>
-              <w:rPr>
-                <w:rFonts w:ascii="Calibri" w:eastAsia="Times New Roman" w:hAnsi="Calibri" w:cs="Calibri"/>
-                <w:b/>
-                <w:bCs/>
-                <w:color w:val="FFFFFF"/>
-                <w:lang w:eastAsia="es-ES"/>
-              </w:rPr>
-              <w:t>by</w:t>
-            </w:r>
-            <w:proofErr w:type="spellEnd"/>
+              <w:t>viewed by</w:t>
+            </w:r>
             <w:r>
               <w:rPr>
                 <w:rFonts w:ascii="Calibri" w:eastAsia="Times New Roman" w:hAnsi="Calibri" w:cs="Calibri"/>
@@ -8787,7 +8422,6 @@
                 <w:lang w:eastAsia="es-ES"/>
               </w:rPr>
             </w:pPr>
-            <w:proofErr w:type="spellStart"/>
             <w:r>
               <w:rPr>
                 <w:rFonts w:ascii="Calibri" w:eastAsia="Times New Roman" w:hAnsi="Calibri" w:cs="Calibri"/>
@@ -8796,31 +8430,8 @@
                 <w:color w:val="FFFFFF"/>
                 <w:lang w:eastAsia="es-ES"/>
               </w:rPr>
-              <w:t>Approved</w:t>
-            </w:r>
-            <w:proofErr w:type="spellEnd"/>
-            <w:r>
-              <w:rPr>
-                <w:rFonts w:ascii="Calibri" w:eastAsia="Times New Roman" w:hAnsi="Calibri" w:cs="Calibri"/>
-                <w:b/>
-                <w:bCs/>
-                <w:color w:val="FFFFFF"/>
-                <w:lang w:eastAsia="es-ES"/>
-              </w:rPr>
-              <w:t xml:space="preserve"> </w:t>
-            </w:r>
-            <w:proofErr w:type="spellStart"/>
-            <w:r>
-              <w:rPr>
-                <w:rFonts w:ascii="Calibri" w:eastAsia="Times New Roman" w:hAnsi="Calibri" w:cs="Calibri"/>
-                <w:b/>
-                <w:bCs/>
-                <w:color w:val="FFFFFF"/>
-                <w:lang w:eastAsia="es-ES"/>
-              </w:rPr>
-              <w:t>by</w:t>
-            </w:r>
-            <w:proofErr w:type="spellEnd"/>
+              <w:t>Approved by</w:t>
+            </w:r>
           </w:p>
         </w:tc>
         <w:tc>
@@ -9193,7 +8804,6 @@
                 <w:lang w:eastAsia="es-ES"/>
               </w:rPr>
             </w:pPr>
-            <w:proofErr w:type="spellStart"/>
             <w:r>
               <w:rPr>
                 <w:rFonts w:ascii="Calibri" w:eastAsia="Times New Roman" w:hAnsi="Calibri" w:cs="Calibri"/>
@@ -9212,31 +8822,8 @@
                 <w:color w:val="FFFFFF"/>
                 <w:lang w:eastAsia="es-ES"/>
               </w:rPr>
-              <w:t>viewed</w:t>
-            </w:r>
-            <w:proofErr w:type="spellEnd"/>
-            <w:r>
-              <w:rPr>
-                <w:rFonts w:ascii="Calibri" w:eastAsia="Times New Roman" w:hAnsi="Calibri" w:cs="Calibri"/>
-                <w:b/>
-                <w:bCs/>
-                <w:color w:val="FFFFFF"/>
-                <w:lang w:eastAsia="es-ES"/>
-              </w:rPr>
-              <w:t xml:space="preserve"> </w:t>
-            </w:r>
-            <w:proofErr w:type="spellStart"/>
-            <w:r>
-              <w:rPr>
-                <w:rFonts w:ascii="Calibri" w:eastAsia="Times New Roman" w:hAnsi="Calibri" w:cs="Calibri"/>
-                <w:b/>
-                <w:bCs/>
-                <w:color w:val="FFFFFF"/>
-                <w:lang w:eastAsia="es-ES"/>
-              </w:rPr>
-              <w:t>by</w:t>
-            </w:r>
-            <w:proofErr w:type="spellEnd"/>
+              <w:t>viewed by</w:t>
+            </w:r>
           </w:p>
         </w:tc>
         <w:tc>
@@ -9348,7 +8935,6 @@
                 <w:lang w:eastAsia="es-ES"/>
               </w:rPr>
             </w:pPr>
-            <w:proofErr w:type="spellStart"/>
             <w:r>
               <w:rPr>
                 <w:rFonts w:ascii="Calibri" w:eastAsia="Times New Roman" w:hAnsi="Calibri" w:cs="Calibri"/>
@@ -9367,18 +8953,7 @@
                 <w:color w:val="FFFFFF"/>
                 <w:lang w:eastAsia="es-ES"/>
               </w:rPr>
-              <w:t>proved</w:t>
-            </w:r>
-            <w:proofErr w:type="spellEnd"/>
-            <w:r>
-              <w:rPr>
-                <w:rFonts w:ascii="Calibri" w:eastAsia="Times New Roman" w:hAnsi="Calibri" w:cs="Calibri"/>
-                <w:b/>
-                <w:bCs/>
-                <w:color w:val="FFFFFF"/>
-                <w:lang w:eastAsia="es-ES"/>
-              </w:rPr>
-              <w:t xml:space="preserve"> by</w:t>
+              <w:t>proved by</w:t>
             </w:r>
           </w:p>
         </w:tc>
@@ -19294,6 +18869,91 @@
 </file>
 
 <file path=customXml/item2.xml><?xml version="1.0" encoding="utf-8"?>
+<b:Sources xmlns:b="http://schemas.openxmlformats.org/officeDocument/2006/bibliography" xmlns="http://schemas.openxmlformats.org/officeDocument/2006/bibliography" SelectedStyle="\APA.XSL" StyleName="APA"/>
+</file>
+
+<file path=customXml/item3.xml><?xml version="1.0" encoding="utf-8"?>
+<p:properties xmlns:p="http://schemas.microsoft.com/office/2006/metadata/properties" xmlns:xsi="http://www.w3.org/2001/XMLSchema-instance" xmlns:pc="http://schemas.microsoft.com/office/infopath/2007/PartnerControls">
+  <documentManagement>
+    <SharedWithUsers xmlns="e692d05a-8f3f-4f3c-9f7a-297d33913966">
+      <UserInfo>
+        <DisplayName>Federico Damian Medina</DisplayName>
+        <AccountId>2357</AccountId>
+        <AccountType/>
+      </UserInfo>
+      <UserInfo>
+        <DisplayName>Adrián García</DisplayName>
+        <AccountId>2347</AccountId>
+        <AccountType/>
+      </UserInfo>
+      <UserInfo>
+        <DisplayName>Nicolas Roberto Yapura Olivera</DisplayName>
+        <AccountId>2348</AccountId>
+        <AccountType/>
+      </UserInfo>
+      <UserInfo>
+        <DisplayName>Gabriel Ocampo</DisplayName>
+        <AccountId>21</AccountId>
+        <AccountType/>
+      </UserInfo>
+      <UserInfo>
+        <DisplayName>Gabriela Tornati</DisplayName>
+        <AccountId>18</AccountId>
+        <AccountType/>
+      </UserInfo>
+      <UserInfo>
+        <DisplayName>Johan Malave Gomez</DisplayName>
+        <AccountId>3303</AccountId>
+        <AccountType/>
+      </UserInfo>
+      <UserInfo>
+        <DisplayName>David Garcia</DisplayName>
+        <AccountId>3305</AccountId>
+        <AccountType/>
+      </UserInfo>
+      <UserInfo>
+        <DisplayName>Maria Soledad Martinez</DisplayName>
+        <AccountId>3994</AccountId>
+        <AccountType/>
+      </UserInfo>
+      <UserInfo>
+        <DisplayName>Seoane, Maria Laura (A-id)</DisplayName>
+        <AccountId>2383</AccountId>
+        <AccountType/>
+      </UserInfo>
+      <UserInfo>
+        <DisplayName>Juliana Comunelli</DisplayName>
+        <AccountId>4193</AccountId>
+        <AccountType/>
+      </UserInfo>
+      <UserInfo>
+        <DisplayName>Pelle, Maria Celeste (A-id)</DisplayName>
+        <AccountId>2387</AccountId>
+        <AccountType/>
+      </UserInfo>
+    </SharedWithUsers>
+    <MediaLengthInSeconds xmlns="7c9733af-7a48-497e-be4f-98a48d8b296c" xsi:nil="true"/>
+    <Progress_x0020__x0025_ xmlns="126aced9-e92e-431b-8860-19f9000349a9" xsi:nil="true"/>
+    <lcf76f155ced4ddcb4097134ff3c332f xmlns="7c9733af-7a48-497e-be4f-98a48d8b296c">
+      <Terms xmlns="http://schemas.microsoft.com/office/infopath/2007/PartnerControls"/>
+    </lcf76f155ced4ddcb4097134ff3c332f>
+    <TaxCatchAll xmlns="126aced9-e92e-431b-8860-19f9000349a9" xsi:nil="true"/>
+    <Target_x0020_Date xmlns="126aced9-e92e-431b-8860-19f9000349a9" xsi:nil="true"/>
+    <Document_x0020_Type xmlns="126aced9-e92e-431b-8860-19f9000349a9">Choose Document Type…</Document_x0020_Type>
+  </documentManagement>
+</p:properties>
+</file>
+
+<file path=customXml/item4.xml><?xml version="1.0" encoding="utf-8"?>
+<?mso-contentType ?>
+<FormTemplates xmlns="http://schemas.microsoft.com/sharepoint/v3/contenttype/forms">
+  <Display>DocumentLibraryForm</Display>
+  <Edit>DocumentLibraryForm</Edit>
+  <New>DocumentLibraryForm</New>
+</FormTemplates>
+</file>
+
+<file path=customXml/item5.xml><?xml version="1.0" encoding="utf-8"?>
 <ct:contentTypeSchema xmlns:ct="http://schemas.microsoft.com/office/2006/metadata/contentType" xmlns:ma="http://schemas.microsoft.com/office/2006/metadata/properties/metaAttributes" ct:_="" ma:_="" ma:contentTypeName="Document" ma:contentTypeID="0x0101003E5E40AF5AAB644388956D1EDB5811C4" ma:contentTypeVersion="" ma:contentTypeDescription="Create a new document." ma:contentTypeScope="" ma:versionID="eb9d285613b0b7fd252419e165da78ff">
   <xsd:schema xmlns:xsd="http://www.w3.org/2001/XMLSchema" xmlns:xs="http://www.w3.org/2001/XMLSchema" xmlns:p="http://schemas.microsoft.com/office/2006/metadata/properties" xmlns:ns2="126aced9-e92e-431b-8860-19f9000349a9" xmlns:ns3="7c9733af-7a48-497e-be4f-98a48d8b296c" xmlns:ns4="e692d05a-8f3f-4f3c-9f7a-297d33913966" targetNamespace="http://schemas.microsoft.com/office/2006/metadata/properties" ma:root="true" ma:fieldsID="5804f93a32e9328b48f081a9ad710d90" ns2:_="" ns3:_="" ns4:_="">
     <xsd:import namespace="126aced9-e92e-431b-8860-19f9000349a9"/>
@@ -19566,91 +19226,6 @@
 </ct:contentTypeSchema>
 </file>
 
-<file path=customXml/item3.xml><?xml version="1.0" encoding="utf-8"?>
-<?mso-contentType ?>
-<FormTemplates xmlns="http://schemas.microsoft.com/sharepoint/v3/contenttype/forms">
-  <Display>DocumentLibraryForm</Display>
-  <Edit>DocumentLibraryForm</Edit>
-  <New>DocumentLibraryForm</New>
-</FormTemplates>
-</file>
-
-<file path=customXml/item4.xml><?xml version="1.0" encoding="utf-8"?>
-<p:properties xmlns:p="http://schemas.microsoft.com/office/2006/metadata/properties" xmlns:xsi="http://www.w3.org/2001/XMLSchema-instance" xmlns:pc="http://schemas.microsoft.com/office/infopath/2007/PartnerControls">
-  <documentManagement>
-    <SharedWithUsers xmlns="e692d05a-8f3f-4f3c-9f7a-297d33913966">
-      <UserInfo>
-        <DisplayName>Federico Damian Medina</DisplayName>
-        <AccountId>2357</AccountId>
-        <AccountType/>
-      </UserInfo>
-      <UserInfo>
-        <DisplayName>Adrián García</DisplayName>
-        <AccountId>2347</AccountId>
-        <AccountType/>
-      </UserInfo>
-      <UserInfo>
-        <DisplayName>Nicolas Roberto Yapura Olivera</DisplayName>
-        <AccountId>2348</AccountId>
-        <AccountType/>
-      </UserInfo>
-      <UserInfo>
-        <DisplayName>Gabriel Ocampo</DisplayName>
-        <AccountId>21</AccountId>
-        <AccountType/>
-      </UserInfo>
-      <UserInfo>
-        <DisplayName>Gabriela Tornati</DisplayName>
-        <AccountId>18</AccountId>
-        <AccountType/>
-      </UserInfo>
-      <UserInfo>
-        <DisplayName>Johan Malave Gomez</DisplayName>
-        <AccountId>3303</AccountId>
-        <AccountType/>
-      </UserInfo>
-      <UserInfo>
-        <DisplayName>David Garcia</DisplayName>
-        <AccountId>3305</AccountId>
-        <AccountType/>
-      </UserInfo>
-      <UserInfo>
-        <DisplayName>Maria Soledad Martinez</DisplayName>
-        <AccountId>3994</AccountId>
-        <AccountType/>
-      </UserInfo>
-      <UserInfo>
-        <DisplayName>Seoane, Maria Laura (A-id)</DisplayName>
-        <AccountId>2383</AccountId>
-        <AccountType/>
-      </UserInfo>
-      <UserInfo>
-        <DisplayName>Juliana Comunelli</DisplayName>
-        <AccountId>4193</AccountId>
-        <AccountType/>
-      </UserInfo>
-      <UserInfo>
-        <DisplayName>Pelle, Maria Celeste (A-id)</DisplayName>
-        <AccountId>2387</AccountId>
-        <AccountType/>
-      </UserInfo>
-    </SharedWithUsers>
-    <MediaLengthInSeconds xmlns="7c9733af-7a48-497e-be4f-98a48d8b296c" xsi:nil="true"/>
-    <Progress_x0020__x0025_ xmlns="126aced9-e92e-431b-8860-19f9000349a9" xsi:nil="true"/>
-    <lcf76f155ced4ddcb4097134ff3c332f xmlns="7c9733af-7a48-497e-be4f-98a48d8b296c">
-      <Terms xmlns="http://schemas.microsoft.com/office/infopath/2007/PartnerControls"/>
-    </lcf76f155ced4ddcb4097134ff3c332f>
-    <TaxCatchAll xmlns="126aced9-e92e-431b-8860-19f9000349a9" xsi:nil="true"/>
-    <Target_x0020_Date xmlns="126aced9-e92e-431b-8860-19f9000349a9" xsi:nil="true"/>
-    <Document_x0020_Type xmlns="126aced9-e92e-431b-8860-19f9000349a9">Choose Document Type…</Document_x0020_Type>
-  </documentManagement>
-</p:properties>
-</file>
-
-<file path=customXml/item5.xml><?xml version="1.0" encoding="utf-8"?>
-<b:Sources xmlns:b="http://schemas.openxmlformats.org/officeDocument/2006/bibliography" xmlns="http://schemas.openxmlformats.org/officeDocument/2006/bibliography" SelectedStyle="\APA.XSL" StyleName="APA"/>
-</file>
-
 <file path=customXml/itemProps1.xml><?xml version="1.0" encoding="utf-8"?>
 <ds:datastoreItem xmlns:ds="http://schemas.openxmlformats.org/officeDocument/2006/customXml" ds:itemID="{55AF091B-3C7A-41E3-B477-F2FDAA23CFDA}">
   <ds:schemaRefs>
@@ -19660,6 +19235,34 @@
 </file>
 
 <file path=customXml/itemProps2.xml><?xml version="1.0" encoding="utf-8"?>
+<ds:datastoreItem xmlns:ds="http://schemas.openxmlformats.org/officeDocument/2006/customXml" ds:itemID="{960B7B98-C93C-45CA-ADCD-07AEDD7280FD}">
+  <ds:schemaRefs>
+    <ds:schemaRef ds:uri="http://schemas.openxmlformats.org/officeDocument/2006/bibliography"/>
+  </ds:schemaRefs>
+</ds:datastoreItem>
+</file>
+
+<file path=customXml/itemProps3.xml><?xml version="1.0" encoding="utf-8"?>
+<ds:datastoreItem xmlns:ds="http://schemas.openxmlformats.org/officeDocument/2006/customXml" ds:itemID="{ED4A838A-6700-4746-8E85-0AE11B429EB7}">
+  <ds:schemaRefs>
+    <ds:schemaRef ds:uri="http://schemas.microsoft.com/office/2006/metadata/properties"/>
+    <ds:schemaRef ds:uri="http://schemas.microsoft.com/office/infopath/2007/PartnerControls"/>
+    <ds:schemaRef ds:uri="e692d05a-8f3f-4f3c-9f7a-297d33913966"/>
+    <ds:schemaRef ds:uri="7c9733af-7a48-497e-be4f-98a48d8b296c"/>
+    <ds:schemaRef ds:uri="126aced9-e92e-431b-8860-19f9000349a9"/>
+  </ds:schemaRefs>
+</ds:datastoreItem>
+</file>
+
+<file path=customXml/itemProps4.xml><?xml version="1.0" encoding="utf-8"?>
+<ds:datastoreItem xmlns:ds="http://schemas.openxmlformats.org/officeDocument/2006/customXml" ds:itemID="{C2E9D9F7-1128-4CE9-A3D9-F2E0BE8A9904}">
+  <ds:schemaRefs>
+    <ds:schemaRef ds:uri="http://schemas.microsoft.com/sharepoint/v3/contenttype/forms"/>
+  </ds:schemaRefs>
+</ds:datastoreItem>
+</file>
+
+<file path=customXml/itemProps5.xml><?xml version="1.0" encoding="utf-8"?>
 <ds:datastoreItem xmlns:ds="http://schemas.openxmlformats.org/officeDocument/2006/customXml" ds:itemID="{7FA7E414-AF2B-4FB6-9A7F-3A449009958A}">
   <ds:schemaRefs>
     <ds:schemaRef ds:uri="http://schemas.microsoft.com/office/2006/metadata/contentType"/>
@@ -19679,34 +19282,6 @@
 </ds:datastoreItem>
 </file>
 
-<file path=customXml/itemProps3.xml><?xml version="1.0" encoding="utf-8"?>
-<ds:datastoreItem xmlns:ds="http://schemas.openxmlformats.org/officeDocument/2006/customXml" ds:itemID="{C2E9D9F7-1128-4CE9-A3D9-F2E0BE8A9904}">
-  <ds:schemaRefs>
-    <ds:schemaRef ds:uri="http://schemas.microsoft.com/sharepoint/v3/contenttype/forms"/>
-  </ds:schemaRefs>
-</ds:datastoreItem>
-</file>
-
-<file path=customXml/itemProps4.xml><?xml version="1.0" encoding="utf-8"?>
-<ds:datastoreItem xmlns:ds="http://schemas.openxmlformats.org/officeDocument/2006/customXml" ds:itemID="{ED4A838A-6700-4746-8E85-0AE11B429EB7}">
-  <ds:schemaRefs>
-    <ds:schemaRef ds:uri="http://schemas.microsoft.com/office/2006/metadata/properties"/>
-    <ds:schemaRef ds:uri="http://schemas.microsoft.com/office/infopath/2007/PartnerControls"/>
-    <ds:schemaRef ds:uri="e692d05a-8f3f-4f3c-9f7a-297d33913966"/>
-    <ds:schemaRef ds:uri="7c9733af-7a48-497e-be4f-98a48d8b296c"/>
-    <ds:schemaRef ds:uri="126aced9-e92e-431b-8860-19f9000349a9"/>
-  </ds:schemaRefs>
-</ds:datastoreItem>
-</file>
-
-<file path=customXml/itemProps5.xml><?xml version="1.0" encoding="utf-8"?>
-<ds:datastoreItem xmlns:ds="http://schemas.openxmlformats.org/officeDocument/2006/customXml" ds:itemID="{960B7B98-C93C-45CA-ADCD-07AEDD7280FD}">
-  <ds:schemaRefs>
-    <ds:schemaRef ds:uri="http://schemas.openxmlformats.org/officeDocument/2006/bibliography"/>
-  </ds:schemaRefs>
-</ds:datastoreItem>
-</file>
-
 <file path=docMetadata/LabelInfo.xml><?xml version="1.0" encoding="utf-8"?>
 <clbl:labelList xmlns:clbl="http://schemas.microsoft.com/office/2020/mipLabelMetadata">
   <clbl:label id="{b1c9b508-7c6e-42bd-bedf-808292653d6c}" enabled="1" method="Standard" siteId="{2882be50-2012-4d88-ac86-544124e120c8}" contentBits="3" removed="0"/>

</xml_diff>

<commit_message>
actualización pantalla load y pantalla verify para pdd
</commit_message>
<xml_diff>
--- a/templates/PDD.docx
+++ b/templates/PDD.docx
@@ -2272,7 +2272,25 @@
                 <w:sz w:val="20"/>
                 <w:szCs w:val="20"/>
               </w:rPr>
-              <w:t>{{r.version}}</w:t>
+              <w:t>{{</w:t>
+            </w:r>
+            <w:proofErr w:type="spellStart"/>
+            <w:r>
+              <w:rPr>
+                <w:rFonts w:cs="Segoe UI"/>
+                <w:sz w:val="20"/>
+                <w:szCs w:val="20"/>
+              </w:rPr>
+              <w:t>r.version</w:t>
+            </w:r>
+            <w:proofErr w:type="spellEnd"/>
+            <w:r>
+              <w:rPr>
+                <w:rFonts w:cs="Segoe UI"/>
+                <w:sz w:val="20"/>
+                <w:szCs w:val="20"/>
+              </w:rPr>
+              <w:t>}}</w:t>
             </w:r>
           </w:p>
         </w:tc>
@@ -2680,78 +2698,6 @@
         </w:tc>
       </w:tr>
     </w:tbl>
-    <w:p>
-      <w:pPr>
-        <w:rPr>
-          <w:rFonts w:cs="Segoe UI"/>
-          <w:lang w:val="en-US"/>
-        </w:rPr>
-      </w:pPr>
-    </w:p>
-    <w:p>
-      <w:pPr>
-        <w:rPr>
-          <w:rFonts w:cs="Segoe UI"/>
-          <w:lang w:val="en-US"/>
-        </w:rPr>
-      </w:pPr>
-    </w:p>
-    <w:p>
-      <w:pPr>
-        <w:rPr>
-          <w:rFonts w:cs="Segoe UI"/>
-          <w:lang w:val="en-US"/>
-        </w:rPr>
-      </w:pPr>
-    </w:p>
-    <w:p>
-      <w:pPr>
-        <w:rPr>
-          <w:rFonts w:cs="Segoe UI"/>
-          <w:lang w:val="en-US"/>
-        </w:rPr>
-      </w:pPr>
-    </w:p>
-    <w:p>
-      <w:pPr>
-        <w:rPr>
-          <w:rFonts w:cs="Segoe UI"/>
-          <w:lang w:val="en-US"/>
-        </w:rPr>
-      </w:pPr>
-    </w:p>
-    <w:p>
-      <w:pPr>
-        <w:rPr>
-          <w:rFonts w:cs="Segoe UI"/>
-          <w:lang w:val="en-US"/>
-        </w:rPr>
-      </w:pPr>
-    </w:p>
-    <w:p>
-      <w:pPr>
-        <w:rPr>
-          <w:rFonts w:cs="Segoe UI"/>
-          <w:lang w:val="en-US"/>
-        </w:rPr>
-      </w:pPr>
-    </w:p>
-    <w:p>
-      <w:pPr>
-        <w:rPr>
-          <w:rFonts w:cs="Segoe UI"/>
-          <w:lang w:val="en-US"/>
-        </w:rPr>
-      </w:pPr>
-    </w:p>
-    <w:p>
-      <w:pPr>
-        <w:rPr>
-          <w:rFonts w:cs="Segoe UI"/>
-          <w:lang w:val="en-US"/>
-        </w:rPr>
-      </w:pPr>
-    </w:p>
     <w:p>
       <w:pPr>
         <w:rPr>
@@ -4493,7 +4439,7 @@
     <w:p>
       <w:pPr>
         <w:spacing w:before="100" w:beforeAutospacing="1" w:after="100" w:afterAutospacing="1"/>
-        <w:jc w:val="left"/>
+        <w:jc w:val="center"/>
         <w:rPr>
           <w:rFonts w:ascii="Times New Roman" w:eastAsia="Times New Roman" w:hAnsi="Times New Roman" w:cs="Times New Roman"/>
           <w:color w:val="auto"/>
@@ -4558,7 +4504,7 @@
     <w:p>
       <w:pPr>
         <w:spacing w:before="100" w:beforeAutospacing="1" w:after="100" w:afterAutospacing="1"/>
-        <w:jc w:val="left"/>
+        <w:jc w:val="center"/>
         <w:rPr>
           <w:rFonts w:ascii="Times New Roman" w:eastAsia="Times New Roman" w:hAnsi="Times New Roman" w:cs="Times New Roman"/>
           <w:color w:val="auto"/>
@@ -4641,7 +4587,25 @@
           <w:sz w:val="20"/>
           <w:szCs w:val="20"/>
         </w:rPr>
-        <w:t xml:space="preserve">{% for </w:t>
+        <w:t>{%</w:t>
+      </w:r>
+      <w:r>
+        <w:rPr>
+          <w:rFonts w:eastAsia="Segoe UI" w:cs="Segoe UI"/>
+          <w:color w:val="808080" w:themeColor="background1" w:themeShade="80"/>
+          <w:sz w:val="20"/>
+          <w:szCs w:val="20"/>
+        </w:rPr>
+        <w:t>p</w:t>
+      </w:r>
+      <w:r>
+        <w:rPr>
+          <w:rFonts w:eastAsia="Segoe UI" w:cs="Segoe UI"/>
+          <w:color w:val="808080" w:themeColor="background1" w:themeShade="80"/>
+          <w:sz w:val="20"/>
+          <w:szCs w:val="20"/>
+        </w:rPr>
+        <w:t xml:space="preserve"> for </w:t>
       </w:r>
       <w:r>
         <w:rPr>
@@ -4687,7 +4651,7 @@
           <w:ilvl w:val="0"/>
           <w:numId w:val="49"/>
         </w:numPr>
-        <w:spacing w:before="0" w:beforeAutospacing="0" w:after="0" w:afterAutospacing="0" w:line="259" w:lineRule="auto"/>
+        <w:spacing w:before="0" w:beforeAutospacing="0" w:after="240" w:afterAutospacing="0" w:line="259" w:lineRule="auto"/>
         <w:rPr>
           <w:rFonts w:eastAsia="Segoe UI" w:cs="Segoe UI"/>
           <w:color w:val="808080" w:themeColor="background1" w:themeShade="80"/>
@@ -4741,7 +4705,25 @@
           <w:sz w:val="20"/>
           <w:szCs w:val="20"/>
         </w:rPr>
-        <w:t>{% endfor %}</w:t>
+        <w:t>{%</w:t>
+      </w:r>
+      <w:r>
+        <w:rPr>
+          <w:rFonts w:eastAsia="Segoe UI" w:cs="Segoe UI"/>
+          <w:color w:val="808080" w:themeColor="background1" w:themeShade="80"/>
+          <w:sz w:val="20"/>
+          <w:szCs w:val="20"/>
+        </w:rPr>
+        <w:t>p</w:t>
+      </w:r>
+      <w:r>
+        <w:rPr>
+          <w:rFonts w:eastAsia="Segoe UI" w:cs="Segoe UI"/>
+          <w:color w:val="808080" w:themeColor="background1" w:themeShade="80"/>
+          <w:sz w:val="20"/>
+          <w:szCs w:val="20"/>
+        </w:rPr>
+        <w:t xml:space="preserve"> endfor %}</w:t>
       </w:r>
     </w:p>
     <w:p>
@@ -4781,7 +4763,25 @@
           <w:sz w:val="20"/>
           <w:szCs w:val="20"/>
         </w:rPr>
-        <w:t xml:space="preserve">{% for </w:t>
+        <w:t>{%</w:t>
+      </w:r>
+      <w:r>
+        <w:rPr>
+          <w:rFonts w:eastAsia="Segoe UI" w:cs="Segoe UI"/>
+          <w:color w:val="808080" w:themeColor="background1" w:themeShade="80"/>
+          <w:sz w:val="20"/>
+          <w:szCs w:val="20"/>
+        </w:rPr>
+        <w:t>p</w:t>
+      </w:r>
+      <w:r>
+        <w:rPr>
+          <w:rFonts w:eastAsia="Segoe UI" w:cs="Segoe UI"/>
+          <w:color w:val="808080" w:themeColor="background1" w:themeShade="80"/>
+          <w:sz w:val="20"/>
+          <w:szCs w:val="20"/>
+        </w:rPr>
+        <w:t xml:space="preserve"> for </w:t>
       </w:r>
       <w:r>
         <w:rPr>
@@ -4827,7 +4827,7 @@
           <w:ilvl w:val="0"/>
           <w:numId w:val="49"/>
         </w:numPr>
-        <w:spacing w:before="0" w:beforeAutospacing="0" w:after="0" w:afterAutospacing="0" w:line="259" w:lineRule="auto"/>
+        <w:spacing w:before="0" w:beforeAutospacing="0" w:after="240" w:afterAutospacing="0" w:line="259" w:lineRule="auto"/>
         <w:rPr>
           <w:rFonts w:eastAsia="Segoe UI" w:cs="Segoe UI"/>
           <w:color w:val="808080" w:themeColor="background1" w:themeShade="80"/>
@@ -4881,7 +4881,25 @@
           <w:sz w:val="20"/>
           <w:szCs w:val="20"/>
         </w:rPr>
-        <w:t>{% endfor %}</w:t>
+        <w:t>{%</w:t>
+      </w:r>
+      <w:r>
+        <w:rPr>
+          <w:rFonts w:eastAsia="Segoe UI" w:cs="Segoe UI"/>
+          <w:color w:val="808080" w:themeColor="background1" w:themeShade="80"/>
+          <w:sz w:val="20"/>
+          <w:szCs w:val="20"/>
+        </w:rPr>
+        <w:t>p</w:t>
+      </w:r>
+      <w:r>
+        <w:rPr>
+          <w:rFonts w:eastAsia="Segoe UI" w:cs="Segoe UI"/>
+          <w:color w:val="808080" w:themeColor="background1" w:themeShade="80"/>
+          <w:sz w:val="20"/>
+          <w:szCs w:val="20"/>
+        </w:rPr>
+        <w:t xml:space="preserve"> endfor %}</w:t>
       </w:r>
     </w:p>
     <w:p>
@@ -5338,6 +5356,7 @@
                 <w:color w:val="808080" w:themeColor="background1" w:themeShade="80"/>
                 <w:sz w:val="20"/>
                 <w:szCs w:val="20"/>
+                <w:lang w:val="en-US"/>
               </w:rPr>
             </w:pPr>
             <w:r>
@@ -5346,8 +5365,9 @@
                 <w:color w:val="808080" w:themeColor="background1" w:themeShade="80"/>
                 <w:sz w:val="20"/>
                 <w:szCs w:val="20"/>
-              </w:rPr>
-              <w:t xml:space="preserve">{% for </w:t>
+                <w:lang w:val="en-US"/>
+              </w:rPr>
+              <w:t>{%</w:t>
             </w:r>
             <w:r>
               <w:rPr>
@@ -5355,8 +5375,9 @@
                 <w:color w:val="808080" w:themeColor="background1" w:themeShade="80"/>
                 <w:sz w:val="20"/>
                 <w:szCs w:val="20"/>
-              </w:rPr>
-              <w:t>contacto</w:t>
+                <w:lang w:val="en-US"/>
+              </w:rPr>
+              <w:t>p</w:t>
             </w:r>
             <w:r>
               <w:rPr>
@@ -5364,27 +5385,56 @@
                 <w:color w:val="808080" w:themeColor="background1" w:themeShade="80"/>
                 <w:sz w:val="20"/>
                 <w:szCs w:val="20"/>
-              </w:rPr>
-              <w:t xml:space="preserve"> in</w:t>
-            </w:r>
+                <w:lang w:val="en-US"/>
+              </w:rPr>
+              <w:t xml:space="preserve"> for </w:t>
+            </w:r>
+            <w:proofErr w:type="spellStart"/>
             <w:r>
               <w:rPr>
                 <w:rFonts w:eastAsia="Segoe UI" w:cs="Segoe UI"/>
                 <w:color w:val="808080" w:themeColor="background1" w:themeShade="80"/>
                 <w:sz w:val="20"/>
                 <w:szCs w:val="20"/>
-              </w:rPr>
-              <w:t xml:space="preserve"> contacto</w:t>
-            </w:r>
+                <w:lang w:val="en-US"/>
+              </w:rPr>
+              <w:t>contacto</w:t>
+            </w:r>
+            <w:proofErr w:type="spellEnd"/>
             <w:r>
               <w:rPr>
                 <w:rFonts w:eastAsia="Segoe UI" w:cs="Segoe UI"/>
                 <w:color w:val="808080" w:themeColor="background1" w:themeShade="80"/>
                 <w:sz w:val="20"/>
                 <w:szCs w:val="20"/>
-              </w:rPr>
-              <w:t>s %}</w:t>
-            </w:r>
+                <w:lang w:val="en-US"/>
+              </w:rPr>
+              <w:t xml:space="preserve"> in </w:t>
+            </w:r>
+            <w:proofErr w:type="spellStart"/>
+            <w:proofErr w:type="gramStart"/>
+            <w:r>
+              <w:rPr>
+                <w:rFonts w:eastAsia="Segoe UI" w:cs="Segoe UI"/>
+                <w:color w:val="808080" w:themeColor="background1" w:themeShade="80"/>
+                <w:sz w:val="20"/>
+                <w:szCs w:val="20"/>
+                <w:lang w:val="en-US"/>
+              </w:rPr>
+              <w:t>contactos</w:t>
+            </w:r>
+            <w:proofErr w:type="spellEnd"/>
+            <w:r>
+              <w:rPr>
+                <w:rFonts w:eastAsia="Segoe UI" w:cs="Segoe UI"/>
+                <w:color w:val="808080" w:themeColor="background1" w:themeShade="80"/>
+                <w:sz w:val="20"/>
+                <w:szCs w:val="20"/>
+                <w:lang w:val="en-US"/>
+              </w:rPr>
+              <w:t xml:space="preserve"> %}</w:t>
+            </w:r>
+            <w:proofErr w:type="gramEnd"/>
           </w:p>
           <w:p>
             <w:pPr>
@@ -5393,7 +5443,7 @@
                 <w:ilvl w:val="0"/>
                 <w:numId w:val="49"/>
               </w:numPr>
-              <w:spacing w:before="0" w:beforeAutospacing="0" w:after="0" w:afterAutospacing="0" w:line="259" w:lineRule="auto"/>
+              <w:spacing w:before="0" w:beforeAutospacing="0" w:after="240" w:afterAutospacing="0" w:line="259" w:lineRule="auto"/>
               <w:rPr>
                 <w:rFonts w:eastAsia="Segoe UI" w:cs="Segoe UI"/>
                 <w:color w:val="808080" w:themeColor="background1" w:themeShade="80"/>
@@ -5447,7 +5497,25 @@
                 <w:sz w:val="20"/>
                 <w:szCs w:val="20"/>
               </w:rPr>
-              <w:t>{% endfor %}</w:t>
+              <w:t>{%</w:t>
+            </w:r>
+            <w:r>
+              <w:rPr>
+                <w:rFonts w:eastAsia="Segoe UI" w:cs="Segoe UI"/>
+                <w:color w:val="808080" w:themeColor="background1" w:themeShade="80"/>
+                <w:sz w:val="20"/>
+                <w:szCs w:val="20"/>
+              </w:rPr>
+              <w:t>p</w:t>
+            </w:r>
+            <w:r>
+              <w:rPr>
+                <w:rFonts w:eastAsia="Segoe UI" w:cs="Segoe UI"/>
+                <w:color w:val="808080" w:themeColor="background1" w:themeShade="80"/>
+                <w:sz w:val="20"/>
+                <w:szCs w:val="20"/>
+              </w:rPr>
+              <w:t xml:space="preserve"> endfor %}</w:t>
             </w:r>
           </w:p>
         </w:tc>
@@ -10106,18 +10174,6 @@
     </w:r>
   </w:p>
 </w:hdr>
-</file>
-
-<file path=word/intelligence2.xml><?xml version="1.0" encoding="utf-8"?>
-<int2:intelligence xmlns:int2="http://schemas.microsoft.com/office/intelligence/2020/intelligence" xmlns:oel="http://schemas.microsoft.com/office/2019/extlst">
-  <int2:observations>
-    <int2:textHash int2:hashCode="aZ6K6SyjHQdTse" int2:id="SqucNLys">
-      <int2:state int2:value="Rejected" int2:type="LegacyProofing"/>
-    </int2:textHash>
-  </int2:observations>
-  <int2:intelligenceSettings/>
-  <int2:onDemandWorkflows/>
-</int2:intelligence>
 </file>
 
 <file path=word/numbering.xml><?xml version="1.0" encoding="utf-8"?>
@@ -18945,15 +19001,6 @@
 </file>
 
 <file path=customXml/item4.xml><?xml version="1.0" encoding="utf-8"?>
-<?mso-contentType ?>
-<FormTemplates xmlns="http://schemas.microsoft.com/sharepoint/v3/contenttype/forms">
-  <Display>DocumentLibraryForm</Display>
-  <Edit>DocumentLibraryForm</Edit>
-  <New>DocumentLibraryForm</New>
-</FormTemplates>
-</file>
-
-<file path=customXml/item5.xml><?xml version="1.0" encoding="utf-8"?>
 <ct:contentTypeSchema xmlns:ct="http://schemas.microsoft.com/office/2006/metadata/contentType" xmlns:ma="http://schemas.microsoft.com/office/2006/metadata/properties/metaAttributes" ct:_="" ma:_="" ma:contentTypeName="Document" ma:contentTypeID="0x0101003E5E40AF5AAB644388956D1EDB5811C4" ma:contentTypeVersion="" ma:contentTypeDescription="Create a new document." ma:contentTypeScope="" ma:versionID="eb9d285613b0b7fd252419e165da78ff">
   <xsd:schema xmlns:xsd="http://www.w3.org/2001/XMLSchema" xmlns:xs="http://www.w3.org/2001/XMLSchema" xmlns:p="http://schemas.microsoft.com/office/2006/metadata/properties" xmlns:ns2="126aced9-e92e-431b-8860-19f9000349a9" xmlns:ns3="7c9733af-7a48-497e-be4f-98a48d8b296c" xmlns:ns4="e692d05a-8f3f-4f3c-9f7a-297d33913966" targetNamespace="http://schemas.microsoft.com/office/2006/metadata/properties" ma:root="true" ma:fieldsID="5804f93a32e9328b48f081a9ad710d90" ns2:_="" ns3:_="" ns4:_="">
     <xsd:import namespace="126aced9-e92e-431b-8860-19f9000349a9"/>
@@ -19226,6 +19273,15 @@
 </ct:contentTypeSchema>
 </file>
 
+<file path=customXml/item5.xml><?xml version="1.0" encoding="utf-8"?>
+<?mso-contentType ?>
+<FormTemplates xmlns="http://schemas.microsoft.com/sharepoint/v3/contenttype/forms">
+  <Display>DocumentLibraryForm</Display>
+  <Edit>DocumentLibraryForm</Edit>
+  <New>DocumentLibraryForm</New>
+</FormTemplates>
+</file>
+
 <file path=customXml/itemProps1.xml><?xml version="1.0" encoding="utf-8"?>
 <ds:datastoreItem xmlns:ds="http://schemas.openxmlformats.org/officeDocument/2006/customXml" ds:itemID="{55AF091B-3C7A-41E3-B477-F2FDAA23CFDA}">
   <ds:schemaRefs>
@@ -19255,14 +19311,6 @@
 </file>
 
 <file path=customXml/itemProps4.xml><?xml version="1.0" encoding="utf-8"?>
-<ds:datastoreItem xmlns:ds="http://schemas.openxmlformats.org/officeDocument/2006/customXml" ds:itemID="{C2E9D9F7-1128-4CE9-A3D9-F2E0BE8A9904}">
-  <ds:schemaRefs>
-    <ds:schemaRef ds:uri="http://schemas.microsoft.com/sharepoint/v3/contenttype/forms"/>
-  </ds:schemaRefs>
-</ds:datastoreItem>
-</file>
-
-<file path=customXml/itemProps5.xml><?xml version="1.0" encoding="utf-8"?>
 <ds:datastoreItem xmlns:ds="http://schemas.openxmlformats.org/officeDocument/2006/customXml" ds:itemID="{7FA7E414-AF2B-4FB6-9A7F-3A449009958A}">
   <ds:schemaRefs>
     <ds:schemaRef ds:uri="http://schemas.microsoft.com/office/2006/metadata/contentType"/>
@@ -19282,6 +19330,14 @@
 </ds:datastoreItem>
 </file>
 
+<file path=customXml/itemProps5.xml><?xml version="1.0" encoding="utf-8"?>
+<ds:datastoreItem xmlns:ds="http://schemas.openxmlformats.org/officeDocument/2006/customXml" ds:itemID="{C2E9D9F7-1128-4CE9-A3D9-F2E0BE8A9904}">
+  <ds:schemaRefs>
+    <ds:schemaRef ds:uri="http://schemas.microsoft.com/sharepoint/v3/contenttype/forms"/>
+  </ds:schemaRefs>
+</ds:datastoreItem>
+</file>
+
 <file path=docMetadata/LabelInfo.xml><?xml version="1.0" encoding="utf-8"?>
 <clbl:labelList xmlns:clbl="http://schemas.microsoft.com/office/2020/mipLabelMetadata">
   <clbl:label id="{b1c9b508-7c6e-42bd-bedf-808292653d6c}" enabled="1" method="Standard" siteId="{2882be50-2012-4d88-ac86-544124e120c8}" contentBits="3" removed="0"/>

</xml_diff>

<commit_message>
eliminar archivos temporales de Word
</commit_message>
<xml_diff>
--- a/templates/PDD.docx
+++ b/templates/PDD.docx
@@ -294,27 +294,7 @@
           <w:sz w:val="72"/>
           <w:szCs w:val="72"/>
         </w:rPr>
-        <w:t>{{</w:t>
-      </w:r>
-      <w:proofErr w:type="spellStart"/>
-      <w:r>
-        <w:rPr>
-          <w:rFonts w:ascii="Segoe UI" w:hAnsi="Segoe UI" w:cs="Segoe UI"/>
-          <w:color w:val="E37800"/>
-          <w:sz w:val="72"/>
-          <w:szCs w:val="72"/>
-        </w:rPr>
-        <w:t>codigoBot</w:t>
-      </w:r>
-      <w:proofErr w:type="spellEnd"/>
-      <w:r>
-        <w:rPr>
-          <w:rFonts w:ascii="Segoe UI" w:hAnsi="Segoe UI" w:cs="Segoe UI"/>
-          <w:color w:val="E37800"/>
-          <w:sz w:val="72"/>
-          <w:szCs w:val="72"/>
-        </w:rPr>
-        <w:t>}}</w:t>
+        <w:t>{{codigoBot}}</w:t>
       </w:r>
       <w:r>
         <w:rPr>
@@ -362,25 +342,7 @@
           <w:sz w:val="36"/>
           <w:szCs w:val="36"/>
         </w:rPr>
-        <w:t>{{</w:t>
-      </w:r>
-      <w:proofErr w:type="spellStart"/>
-      <w:r>
-        <w:rPr>
-          <w:rFonts w:ascii="Segoe UI" w:hAnsi="Segoe UI" w:cs="Segoe UI"/>
-          <w:sz w:val="36"/>
-          <w:szCs w:val="36"/>
-        </w:rPr>
-        <w:t>version</w:t>
-      </w:r>
-      <w:proofErr w:type="spellEnd"/>
-      <w:r>
-        <w:rPr>
-          <w:rFonts w:ascii="Segoe UI" w:hAnsi="Segoe UI" w:cs="Segoe UI"/>
-          <w:sz w:val="36"/>
-          <w:szCs w:val="36"/>
-        </w:rPr>
-        <w:t>}}</w:t>
+        <w:t>{{version}}</w:t>
       </w:r>
       <w:r>
         <w:rPr>
@@ -1257,25 +1219,7 @@
                 <w:sz w:val="20"/>
                 <w:szCs w:val="20"/>
               </w:rPr>
-              <w:t xml:space="preserve"> </w:t>
-            </w:r>
-            <w:proofErr w:type="spellStart"/>
-            <w:r>
-              <w:rPr>
-                <w:rFonts w:cs="Segoe UI"/>
-                <w:sz w:val="20"/>
-                <w:szCs w:val="20"/>
-              </w:rPr>
-              <w:t>endfor</w:t>
-            </w:r>
-            <w:proofErr w:type="spellEnd"/>
-            <w:r>
-              <w:rPr>
-                <w:rFonts w:cs="Segoe UI"/>
-                <w:sz w:val="20"/>
-                <w:szCs w:val="20"/>
-              </w:rPr>
-              <w:t xml:space="preserve"> %}</w:t>
+              <w:t xml:space="preserve"> endfor %}</w:t>
             </w:r>
           </w:p>
         </w:tc>
@@ -2470,25 +2414,7 @@
                 <w:sz w:val="20"/>
                 <w:szCs w:val="20"/>
               </w:rPr>
-              <w:t>{{</w:t>
-            </w:r>
-            <w:proofErr w:type="spellStart"/>
-            <w:r>
-              <w:rPr>
-                <w:rFonts w:cs="Segoe UI"/>
-                <w:sz w:val="20"/>
-                <w:szCs w:val="20"/>
-              </w:rPr>
-              <w:t>r.version</w:t>
-            </w:r>
-            <w:proofErr w:type="spellEnd"/>
-            <w:r>
-              <w:rPr>
-                <w:rFonts w:cs="Segoe UI"/>
-                <w:sz w:val="20"/>
-                <w:szCs w:val="20"/>
-              </w:rPr>
-              <w:t>}}</w:t>
+              <w:t>{{r.version}}</w:t>
             </w:r>
           </w:p>
         </w:tc>
@@ -2708,25 +2634,7 @@
                 <w:sz w:val="20"/>
                 <w:szCs w:val="20"/>
               </w:rPr>
-              <w:t xml:space="preserve"> </w:t>
-            </w:r>
-            <w:proofErr w:type="spellStart"/>
-            <w:r>
-              <w:rPr>
-                <w:rFonts w:cs="Segoe UI"/>
-                <w:sz w:val="20"/>
-                <w:szCs w:val="20"/>
-              </w:rPr>
-              <w:t>endfor</w:t>
-            </w:r>
-            <w:proofErr w:type="spellEnd"/>
-            <w:r>
-              <w:rPr>
-                <w:rFonts w:cs="Segoe UI"/>
-                <w:sz w:val="20"/>
-                <w:szCs w:val="20"/>
-              </w:rPr>
-              <w:t xml:space="preserve"> %}</w:t>
+              <w:t xml:space="preserve"> endfor %}</w:t>
             </w:r>
           </w:p>
         </w:tc>
@@ -4641,14 +4549,12 @@
         </w:rPr>
         <w:t xml:space="preserve">r </w:t>
       </w:r>
-      <w:proofErr w:type="spellStart"/>
       <w:r>
         <w:rPr>
           <w:color w:val="7E7E7E"/>
         </w:rPr>
         <w:t>propositoProceso</w:t>
       </w:r>
-      <w:proofErr w:type="spellEnd"/>
       <w:r>
         <w:rPr>
           <w:color w:val="7E7E7E"/>
@@ -4694,21 +4600,7 @@
         <w:rPr>
           <w:lang w:eastAsia="en-US"/>
         </w:rPr>
-        <w:t xml:space="preserve"> </w:t>
-      </w:r>
-      <w:proofErr w:type="spellStart"/>
-      <w:r>
-        <w:rPr>
-          <w:lang w:eastAsia="en-US"/>
-        </w:rPr>
-        <w:t>level</w:t>
-      </w:r>
-      <w:proofErr w:type="spellEnd"/>
-      <w:r>
-        <w:rPr>
-          <w:lang w:eastAsia="en-US"/>
-        </w:rPr>
-        <w:t xml:space="preserve"> (Solución automatización)</w:t>
+        <w:t xml:space="preserve"> level (Solución automatización)</w:t>
       </w:r>
     </w:p>
     <w:p>
@@ -4772,21 +4664,7 @@
         <w:rPr>
           <w:lang w:eastAsia="en-US"/>
         </w:rPr>
-        <w:t xml:space="preserve">Diagrama de flujo – Low </w:t>
-      </w:r>
-      <w:proofErr w:type="spellStart"/>
-      <w:r>
-        <w:rPr>
-          <w:lang w:eastAsia="en-US"/>
-        </w:rPr>
-        <w:t>level</w:t>
-      </w:r>
-      <w:proofErr w:type="spellEnd"/>
-      <w:r>
-        <w:rPr>
-          <w:lang w:eastAsia="en-US"/>
-        </w:rPr>
-        <w:t xml:space="preserve"> (Solución automatización)</w:t>
+        <w:t>Diagrama de flujo – Low level (Solución automatización)</w:t>
       </w:r>
       <w:bookmarkEnd w:id="17"/>
     </w:p>
@@ -4941,6 +4819,7 @@
           <w:numId w:val="49"/>
         </w:numPr>
         <w:spacing w:before="0" w:beforeAutospacing="0" w:after="240" w:afterAutospacing="0" w:line="259" w:lineRule="auto"/>
+        <w:jc w:val="left"/>
         <w:rPr>
           <w:rFonts w:eastAsia="Segoe UI" w:cs="Segoe UI"/>
           <w:color w:val="808080" w:themeColor="background1" w:themeShade="80"/>
@@ -5012,27 +4891,7 @@
           <w:sz w:val="20"/>
           <w:szCs w:val="20"/>
         </w:rPr>
-        <w:t xml:space="preserve"> </w:t>
-      </w:r>
-      <w:proofErr w:type="spellStart"/>
-      <w:r>
-        <w:rPr>
-          <w:rFonts w:eastAsia="Segoe UI" w:cs="Segoe UI"/>
-          <w:color w:val="808080" w:themeColor="background1" w:themeShade="80"/>
-          <w:sz w:val="20"/>
-          <w:szCs w:val="20"/>
-        </w:rPr>
-        <w:t>endfor</w:t>
-      </w:r>
-      <w:proofErr w:type="spellEnd"/>
-      <w:r>
-        <w:rPr>
-          <w:rFonts w:eastAsia="Segoe UI" w:cs="Segoe UI"/>
-          <w:color w:val="808080" w:themeColor="background1" w:themeShade="80"/>
-          <w:sz w:val="20"/>
-          <w:szCs w:val="20"/>
-        </w:rPr>
-        <w:t xml:space="preserve"> %}</w:t>
+        <w:t xml:space="preserve"> endfor %}</w:t>
       </w:r>
     </w:p>
     <w:p>
@@ -5137,6 +4996,7 @@
           <w:numId w:val="49"/>
         </w:numPr>
         <w:spacing w:before="0" w:beforeAutospacing="0" w:after="240" w:afterAutospacing="0" w:line="259" w:lineRule="auto"/>
+        <w:jc w:val="left"/>
         <w:rPr>
           <w:rFonts w:eastAsia="Segoe UI" w:cs="Segoe UI"/>
           <w:color w:val="808080" w:themeColor="background1" w:themeShade="80"/>
@@ -5208,27 +5068,7 @@
           <w:sz w:val="20"/>
           <w:szCs w:val="20"/>
         </w:rPr>
-        <w:t xml:space="preserve"> </w:t>
-      </w:r>
-      <w:proofErr w:type="spellStart"/>
-      <w:r>
-        <w:rPr>
-          <w:rFonts w:eastAsia="Segoe UI" w:cs="Segoe UI"/>
-          <w:color w:val="808080" w:themeColor="background1" w:themeShade="80"/>
-          <w:sz w:val="20"/>
-          <w:szCs w:val="20"/>
-        </w:rPr>
-        <w:t>endfor</w:t>
-      </w:r>
-      <w:proofErr w:type="spellEnd"/>
-      <w:r>
-        <w:rPr>
-          <w:rFonts w:eastAsia="Segoe UI" w:cs="Segoe UI"/>
-          <w:color w:val="808080" w:themeColor="background1" w:themeShade="80"/>
-          <w:sz w:val="20"/>
-          <w:szCs w:val="20"/>
-        </w:rPr>
-        <w:t xml:space="preserve"> %}</w:t>
+        <w:t xml:space="preserve"> endfor %}</w:t>
       </w:r>
     </w:p>
     <w:p>
@@ -5260,9 +5100,9 @@
         <w:tblLook w:val="01E0" w:firstRow="1" w:lastRow="1" w:firstColumn="1" w:lastColumn="1" w:noHBand="0" w:noVBand="0"/>
       </w:tblPr>
       <w:tblGrid>
-        <w:gridCol w:w="743"/>
-        <w:gridCol w:w="2030"/>
-        <w:gridCol w:w="6900"/>
+        <w:gridCol w:w="792"/>
+        <w:gridCol w:w="2171"/>
+        <w:gridCol w:w="6710"/>
       </w:tblGrid>
       <w:tr>
         <w:trPr>
@@ -5271,7 +5111,7 @@
         </w:trPr>
         <w:tc>
           <w:tcPr>
-            <w:tcW w:w="743" w:type="dxa"/>
+            <w:tcW w:w="792" w:type="dxa"/>
             <w:tcBorders>
               <w:right w:val="single" w:sz="8" w:space="0" w:color="FFFFFF" w:themeColor="background1"/>
             </w:tcBorders>
@@ -5304,7 +5144,7 @@
         </w:tc>
         <w:tc>
           <w:tcPr>
-            <w:tcW w:w="2030" w:type="dxa"/>
+            <w:tcW w:w="2171" w:type="dxa"/>
             <w:tcBorders>
               <w:left w:val="single" w:sz="8" w:space="0" w:color="FFFFFF" w:themeColor="background1"/>
               <w:right w:val="single" w:sz="8" w:space="0" w:color="FFFFFF" w:themeColor="background1"/>
@@ -5338,7 +5178,7 @@
         </w:tc>
         <w:tc>
           <w:tcPr>
-            <w:tcW w:w="6900" w:type="dxa"/>
+            <w:tcW w:w="6710" w:type="dxa"/>
             <w:tcBorders>
               <w:left w:val="single" w:sz="8" w:space="0" w:color="FFFFFF" w:themeColor="background1"/>
               <w:right w:val="single" w:sz="8" w:space="0" w:color="FFFFFF" w:themeColor="background1"/>
@@ -5377,7 +5217,7 @@
         </w:trPr>
         <w:tc>
           <w:tcPr>
-            <w:tcW w:w="743" w:type="dxa"/>
+            <w:tcW w:w="792" w:type="dxa"/>
             <w:tcBorders>
               <w:top w:val="single" w:sz="8" w:space="0" w:color="7F7F7F" w:themeColor="text1" w:themeTint="80"/>
               <w:bottom w:val="single" w:sz="8" w:space="0" w:color="7F7F7F" w:themeColor="text1" w:themeTint="80"/>
@@ -5387,12 +5227,13 @@
           <w:p>
             <w:pPr>
               <w:pStyle w:val="Style30"/>
+              <w:ind w:left="690"/>
             </w:pPr>
           </w:p>
         </w:tc>
         <w:tc>
           <w:tcPr>
-            <w:tcW w:w="2030" w:type="dxa"/>
+            <w:tcW w:w="2171" w:type="dxa"/>
             <w:tcBorders>
               <w:top w:val="single" w:sz="8" w:space="0" w:color="7F7F7F" w:themeColor="text1" w:themeTint="80"/>
               <w:left w:val="single" w:sz="8" w:space="0" w:color="7F7F7F" w:themeColor="text1" w:themeTint="80"/>
@@ -5422,7 +5263,7 @@
         </w:tc>
         <w:tc>
           <w:tcPr>
-            <w:tcW w:w="6900" w:type="dxa"/>
+            <w:tcW w:w="6710" w:type="dxa"/>
             <w:tcBorders>
               <w:top w:val="single" w:sz="8" w:space="0" w:color="7F7F7F" w:themeColor="text1" w:themeTint="80"/>
               <w:left w:val="single" w:sz="8" w:space="0" w:color="7F7F7F" w:themeColor="text1" w:themeTint="80"/>
@@ -5474,7 +5315,7 @@
         </w:trPr>
         <w:tc>
           <w:tcPr>
-            <w:tcW w:w="743" w:type="dxa"/>
+            <w:tcW w:w="792" w:type="dxa"/>
             <w:tcBorders>
               <w:top w:val="single" w:sz="8" w:space="0" w:color="7F7F7F" w:themeColor="text1" w:themeTint="80"/>
               <w:bottom w:val="single" w:sz="8" w:space="0" w:color="7F7F7F" w:themeColor="text1" w:themeTint="80"/>
@@ -5484,12 +5325,13 @@
           <w:p>
             <w:pPr>
               <w:pStyle w:val="Style30"/>
+              <w:ind w:left="690"/>
             </w:pPr>
           </w:p>
         </w:tc>
         <w:tc>
           <w:tcPr>
-            <w:tcW w:w="2030" w:type="dxa"/>
+            <w:tcW w:w="2171" w:type="dxa"/>
             <w:tcBorders>
               <w:top w:val="single" w:sz="8" w:space="0" w:color="7F7F7F" w:themeColor="text1" w:themeTint="80"/>
               <w:left w:val="single" w:sz="8" w:space="0" w:color="7F7F7F" w:themeColor="text1" w:themeTint="80"/>
@@ -5519,7 +5361,7 @@
         </w:tc>
         <w:tc>
           <w:tcPr>
-            <w:tcW w:w="6900" w:type="dxa"/>
+            <w:tcW w:w="6710" w:type="dxa"/>
             <w:tcBorders>
               <w:top w:val="single" w:sz="8" w:space="0" w:color="7F7F7F" w:themeColor="text1" w:themeTint="80"/>
               <w:left w:val="single" w:sz="8" w:space="0" w:color="7F7F7F" w:themeColor="text1" w:themeTint="80"/>
@@ -5571,7 +5413,7 @@
         </w:trPr>
         <w:tc>
           <w:tcPr>
-            <w:tcW w:w="743" w:type="dxa"/>
+            <w:tcW w:w="792" w:type="dxa"/>
             <w:tcBorders>
               <w:top w:val="single" w:sz="8" w:space="0" w:color="7F7F7F" w:themeColor="text1" w:themeTint="80"/>
               <w:bottom w:val="single" w:sz="8" w:space="0" w:color="7F7F7F" w:themeColor="text1" w:themeTint="80"/>
@@ -5581,12 +5423,13 @@
           <w:p>
             <w:pPr>
               <w:pStyle w:val="Style30"/>
+              <w:ind w:left="690"/>
             </w:pPr>
           </w:p>
         </w:tc>
         <w:tc>
           <w:tcPr>
-            <w:tcW w:w="2030" w:type="dxa"/>
+            <w:tcW w:w="2171" w:type="dxa"/>
             <w:tcBorders>
               <w:top w:val="single" w:sz="8" w:space="0" w:color="7F7F7F" w:themeColor="text1" w:themeTint="80"/>
               <w:left w:val="single" w:sz="8" w:space="0" w:color="7F7F7F" w:themeColor="text1" w:themeTint="80"/>
@@ -5624,7 +5467,7 @@
         </w:tc>
         <w:tc>
           <w:tcPr>
-            <w:tcW w:w="6900" w:type="dxa"/>
+            <w:tcW w:w="6710" w:type="dxa"/>
             <w:tcBorders>
               <w:top w:val="single" w:sz="8" w:space="0" w:color="7F7F7F" w:themeColor="text1" w:themeTint="80"/>
               <w:left w:val="single" w:sz="8" w:space="0" w:color="7F7F7F" w:themeColor="text1" w:themeTint="80"/>
@@ -5676,7 +5519,7 @@
         </w:trPr>
         <w:tc>
           <w:tcPr>
-            <w:tcW w:w="743" w:type="dxa"/>
+            <w:tcW w:w="792" w:type="dxa"/>
             <w:tcBorders>
               <w:top w:val="single" w:sz="8" w:space="0" w:color="7F7F7F" w:themeColor="text1" w:themeTint="80"/>
               <w:bottom w:val="single" w:sz="8" w:space="0" w:color="7F7F7F" w:themeColor="text1" w:themeTint="80"/>
@@ -5686,12 +5529,13 @@
           <w:p>
             <w:pPr>
               <w:pStyle w:val="Style30"/>
+              <w:ind w:left="690"/>
             </w:pPr>
           </w:p>
         </w:tc>
         <w:tc>
           <w:tcPr>
-            <w:tcW w:w="2030" w:type="dxa"/>
+            <w:tcW w:w="2171" w:type="dxa"/>
             <w:tcBorders>
               <w:top w:val="single" w:sz="8" w:space="0" w:color="7F7F7F" w:themeColor="text1" w:themeTint="80"/>
               <w:left w:val="single" w:sz="8" w:space="0" w:color="7F7F7F" w:themeColor="text1" w:themeTint="80"/>
@@ -5722,7 +5566,7 @@
         </w:tc>
         <w:tc>
           <w:tcPr>
-            <w:tcW w:w="6900" w:type="dxa"/>
+            <w:tcW w:w="6710" w:type="dxa"/>
             <w:tcBorders>
               <w:top w:val="single" w:sz="8" w:space="0" w:color="7F7F7F" w:themeColor="text1" w:themeTint="80"/>
               <w:left w:val="single" w:sz="8" w:space="0" w:color="7F7F7F" w:themeColor="text1" w:themeTint="80"/>
@@ -5783,7 +5627,7 @@
                 <w:color w:val="808080" w:themeColor="background1" w:themeShade="80"/>
                 <w:sz w:val="20"/>
                 <w:szCs w:val="20"/>
-                <w:lang w:val="en-US"/>
+                <w:lang w:val="es-ES"/>
               </w:rPr>
             </w:pPr>
             <w:r>
@@ -5792,7 +5636,7 @@
                 <w:color w:val="808080" w:themeColor="background1" w:themeShade="80"/>
                 <w:sz w:val="20"/>
                 <w:szCs w:val="20"/>
-                <w:lang w:val="en-US"/>
+                <w:lang w:val="es-ES"/>
               </w:rPr>
               <w:t>{%</w:t>
             </w:r>
@@ -5802,7 +5646,7 @@
                 <w:color w:val="808080" w:themeColor="background1" w:themeShade="80"/>
                 <w:sz w:val="20"/>
                 <w:szCs w:val="20"/>
-                <w:lang w:val="en-US"/>
+                <w:lang w:val="es-ES"/>
               </w:rPr>
               <w:t>p</w:t>
             </w:r>
@@ -5812,56 +5656,10 @@
                 <w:color w:val="808080" w:themeColor="background1" w:themeShade="80"/>
                 <w:sz w:val="20"/>
                 <w:szCs w:val="20"/>
-                <w:lang w:val="en-US"/>
-              </w:rPr>
-              <w:t xml:space="preserve"> for </w:t>
-            </w:r>
-            <w:proofErr w:type="spellStart"/>
-            <w:r>
-              <w:rPr>
-                <w:rFonts w:eastAsia="Segoe UI" w:cs="Segoe UI"/>
-                <w:color w:val="808080" w:themeColor="background1" w:themeShade="80"/>
-                <w:sz w:val="20"/>
-                <w:szCs w:val="20"/>
-                <w:lang w:val="en-US"/>
-              </w:rPr>
-              <w:t>contacto</w:t>
-            </w:r>
-            <w:proofErr w:type="spellEnd"/>
-            <w:r>
-              <w:rPr>
-                <w:rFonts w:eastAsia="Segoe UI" w:cs="Segoe UI"/>
-                <w:color w:val="808080" w:themeColor="background1" w:themeShade="80"/>
-                <w:sz w:val="20"/>
-                <w:szCs w:val="20"/>
-                <w:lang w:val="en-US"/>
-              </w:rPr>
-              <w:t xml:space="preserve"> in </w:t>
-            </w:r>
-            <w:proofErr w:type="spellStart"/>
-            <w:proofErr w:type="gramStart"/>
-            <w:r>
-              <w:rPr>
-                <w:rFonts w:eastAsia="Segoe UI" w:cs="Segoe UI"/>
-                <w:color w:val="808080" w:themeColor="background1" w:themeShade="80"/>
-                <w:sz w:val="20"/>
-                <w:szCs w:val="20"/>
-                <w:lang w:val="en-US"/>
-              </w:rPr>
-              <w:t>contactos</w:t>
-            </w:r>
-            <w:proofErr w:type="spellEnd"/>
-            <w:r>
-              <w:rPr>
-                <w:rFonts w:eastAsia="Segoe UI" w:cs="Segoe UI"/>
-                <w:color w:val="808080" w:themeColor="background1" w:themeShade="80"/>
-                <w:sz w:val="20"/>
-                <w:szCs w:val="20"/>
-                <w:lang w:val="en-US"/>
-              </w:rPr>
-              <w:t xml:space="preserve"> %}</w:t>
-            </w:r>
-            <w:proofErr w:type="gramEnd"/>
+                <w:lang w:val="es-ES"/>
+              </w:rPr>
+              <w:t xml:space="preserve"> for contacto in contactos %}</w:t>
+            </w:r>
           </w:p>
           <w:p>
             <w:pPr>
@@ -5910,7 +5708,7 @@
           <w:p>
             <w:pPr>
               <w:pStyle w:val="NormalWeb"/>
-              <w:spacing w:before="0" w:beforeAutospacing="0" w:after="240" w:afterAutospacing="0" w:line="259" w:lineRule="auto"/>
+              <w:spacing w:before="0" w:beforeAutospacing="0" w:after="0" w:afterAutospacing="0" w:line="259" w:lineRule="auto"/>
               <w:rPr>
                 <w:rFonts w:eastAsia="Segoe UI" w:cs="Segoe UI"/>
                 <w:color w:val="808080" w:themeColor="background1" w:themeShade="80"/>
@@ -5943,28 +5741,20 @@
                 <w:sz w:val="20"/>
                 <w:szCs w:val="20"/>
               </w:rPr>
-              <w:t xml:space="preserve"> </w:t>
-            </w:r>
-            <w:proofErr w:type="spellStart"/>
-            <w:r>
+              <w:t xml:space="preserve"> endfor %}</w:t>
+            </w:r>
+          </w:p>
+          <w:p>
+            <w:pPr>
+              <w:pStyle w:val="NormalWeb"/>
+              <w:spacing w:before="0" w:beforeAutospacing="0" w:after="0" w:afterAutospacing="0" w:line="259" w:lineRule="auto"/>
               <w:rPr>
                 <w:rFonts w:eastAsia="Segoe UI" w:cs="Segoe UI"/>
                 <w:color w:val="808080" w:themeColor="background1" w:themeShade="80"/>
                 <w:sz w:val="20"/>
                 <w:szCs w:val="20"/>
               </w:rPr>
-              <w:t>endfor</w:t>
-            </w:r>
-            <w:proofErr w:type="spellEnd"/>
-            <w:r>
-              <w:rPr>
-                <w:rFonts w:eastAsia="Segoe UI" w:cs="Segoe UI"/>
-                <w:color w:val="808080" w:themeColor="background1" w:themeShade="80"/>
-                <w:sz w:val="20"/>
-                <w:szCs w:val="20"/>
-              </w:rPr>
-              <w:t xml:space="preserve"> %}</w:t>
-            </w:r>
+            </w:pPr>
           </w:p>
         </w:tc>
       </w:tr>
@@ -5974,7 +5764,7 @@
         </w:trPr>
         <w:tc>
           <w:tcPr>
-            <w:tcW w:w="743" w:type="dxa"/>
+            <w:tcW w:w="792" w:type="dxa"/>
             <w:tcBorders>
               <w:top w:val="single" w:sz="8" w:space="0" w:color="7F7F7F" w:themeColor="text1" w:themeTint="80"/>
               <w:bottom w:val="single" w:sz="8" w:space="0" w:color="7F7F7F" w:themeColor="text1" w:themeTint="80"/>
@@ -5984,12 +5774,13 @@
           <w:p>
             <w:pPr>
               <w:pStyle w:val="Style30"/>
+              <w:ind w:left="690"/>
             </w:pPr>
           </w:p>
         </w:tc>
         <w:tc>
           <w:tcPr>
-            <w:tcW w:w="2030" w:type="dxa"/>
+            <w:tcW w:w="2171" w:type="dxa"/>
             <w:tcBorders>
               <w:top w:val="single" w:sz="8" w:space="0" w:color="7F7F7F" w:themeColor="text1" w:themeTint="80"/>
               <w:left w:val="single" w:sz="8" w:space="0" w:color="7F7F7F" w:themeColor="text1" w:themeTint="80"/>
@@ -6019,7 +5810,7 @@
         </w:tc>
         <w:tc>
           <w:tcPr>
-            <w:tcW w:w="6900" w:type="dxa"/>
+            <w:tcW w:w="6710" w:type="dxa"/>
             <w:tcBorders>
               <w:top w:val="single" w:sz="8" w:space="0" w:color="7F7F7F" w:themeColor="text1" w:themeTint="80"/>
               <w:left w:val="single" w:sz="8" w:space="0" w:color="7F7F7F" w:themeColor="text1" w:themeTint="80"/>
@@ -6171,23 +5962,540 @@
         <w:rPr>
           <w:lang w:eastAsia="en-US"/>
         </w:rPr>
-        <w:t>{{</w:t>
-      </w:r>
-      <w:proofErr w:type="spellStart"/>
-      <w:r>
-        <w:rPr>
-          <w:lang w:eastAsia="en-US"/>
-        </w:rPr>
-        <w:t>fase.tituloFase</w:t>
-      </w:r>
-      <w:proofErr w:type="spellEnd"/>
-      <w:r>
-        <w:rPr>
-          <w:lang w:eastAsia="en-US"/>
-        </w:rPr>
-        <w:t>}}</w:t>
+        <w:t>{{fase.tituloFase}}</w:t>
       </w:r>
     </w:p>
+    <w:tbl>
+      <w:tblPr>
+        <w:tblW w:w="9702" w:type="dxa"/>
+        <w:tblInd w:w="108" w:type="dxa"/>
+        <w:tblLayout w:type="fixed"/>
+        <w:tblLook w:val="01E0" w:firstRow="1" w:lastRow="1" w:firstColumn="1" w:lastColumn="1" w:noHBand="0" w:noVBand="0"/>
+      </w:tblPr>
+      <w:tblGrid>
+        <w:gridCol w:w="2952"/>
+        <w:gridCol w:w="2250"/>
+        <w:gridCol w:w="2520"/>
+        <w:gridCol w:w="1980"/>
+      </w:tblGrid>
+      <w:tr>
+        <w:trPr>
+          <w:trHeight w:val="339"/>
+          <w:tblHeader/>
+        </w:trPr>
+        <w:tc>
+          <w:tcPr>
+            <w:tcW w:w="2952" w:type="dxa"/>
+            <w:tcBorders>
+              <w:bottom w:val="single" w:sz="4" w:space="0" w:color="808080" w:themeColor="background1" w:themeShade="80"/>
+              <w:right w:val="single" w:sz="8" w:space="0" w:color="FFFFFF" w:themeColor="background1"/>
+            </w:tcBorders>
+            <w:shd w:val="clear" w:color="auto" w:fill="DD7500"/>
+          </w:tcPr>
+          <w:p>
+            <w:pPr>
+              <w:spacing w:before="80" w:after="80"/>
+              <w:rPr>
+                <w:rFonts w:cs="Segoe UI"/>
+                <w:b/>
+                <w:bCs/>
+                <w:color w:val="FFFFFF" w:themeColor="background1"/>
+              </w:rPr>
+            </w:pPr>
+            <w:r>
+              <w:rPr>
+                <w:rFonts w:cs="Segoe UI"/>
+                <w:b/>
+                <w:bCs/>
+                <w:color w:val="FFFFFF" w:themeColor="background1"/>
+              </w:rPr>
+              <w:t>N°</w:t>
+            </w:r>
+          </w:p>
+        </w:tc>
+        <w:tc>
+          <w:tcPr>
+            <w:tcW w:w="2250" w:type="dxa"/>
+            <w:tcBorders>
+              <w:left w:val="single" w:sz="8" w:space="0" w:color="FFFFFF" w:themeColor="background1"/>
+              <w:bottom w:val="single" w:sz="4" w:space="0" w:color="808080" w:themeColor="background1" w:themeShade="80"/>
+              <w:right w:val="single" w:sz="8" w:space="0" w:color="FFFFFF" w:themeColor="background1"/>
+            </w:tcBorders>
+            <w:shd w:val="clear" w:color="auto" w:fill="DD7500"/>
+          </w:tcPr>
+          <w:p>
+            <w:pPr>
+              <w:spacing w:before="80" w:after="80"/>
+              <w:rPr>
+                <w:rFonts w:cs="Segoe UI"/>
+                <w:b/>
+                <w:bCs/>
+                <w:color w:val="FFFFFF" w:themeColor="background1"/>
+              </w:rPr>
+            </w:pPr>
+            <w:r>
+              <w:rPr>
+                <w:rFonts w:cs="Segoe UI"/>
+                <w:b/>
+                <w:bCs/>
+                <w:color w:val="FFFFFF" w:themeColor="background1"/>
+              </w:rPr>
+              <w:t>Acción</w:t>
+            </w:r>
+          </w:p>
+        </w:tc>
+        <w:tc>
+          <w:tcPr>
+            <w:tcW w:w="2520" w:type="dxa"/>
+            <w:tcBorders>
+              <w:left w:val="single" w:sz="8" w:space="0" w:color="FFFFFF" w:themeColor="background1"/>
+              <w:bottom w:val="single" w:sz="4" w:space="0" w:color="808080" w:themeColor="background1" w:themeShade="80"/>
+              <w:right w:val="single" w:sz="8" w:space="0" w:color="FFFFFF" w:themeColor="background1"/>
+            </w:tcBorders>
+            <w:shd w:val="clear" w:color="auto" w:fill="DD7500"/>
+          </w:tcPr>
+          <w:p>
+            <w:pPr>
+              <w:spacing w:before="80" w:after="80"/>
+              <w:rPr>
+                <w:rFonts w:cs="Segoe UI"/>
+                <w:b/>
+                <w:bCs/>
+                <w:color w:val="FFFFFF" w:themeColor="background1"/>
+              </w:rPr>
+            </w:pPr>
+            <w:r>
+              <w:rPr>
+                <w:rFonts w:cs="Segoe UI"/>
+                <w:b/>
+                <w:bCs/>
+                <w:color w:val="FFFFFF" w:themeColor="background1"/>
+              </w:rPr>
+              <w:t>Detalle</w:t>
+            </w:r>
+          </w:p>
+        </w:tc>
+        <w:tc>
+          <w:tcPr>
+            <w:tcW w:w="1980" w:type="dxa"/>
+            <w:tcBorders>
+              <w:left w:val="single" w:sz="8" w:space="0" w:color="FFFFFF" w:themeColor="background1"/>
+              <w:bottom w:val="single" w:sz="4" w:space="0" w:color="808080" w:themeColor="background1" w:themeShade="80"/>
+              <w:right w:val="single" w:sz="8" w:space="0" w:color="FFFFFF" w:themeColor="background1"/>
+            </w:tcBorders>
+            <w:shd w:val="clear" w:color="auto" w:fill="DD7500"/>
+          </w:tcPr>
+          <w:p>
+            <w:pPr>
+              <w:spacing w:before="80" w:after="80"/>
+              <w:rPr>
+                <w:rFonts w:cs="Segoe UI"/>
+                <w:b/>
+                <w:bCs/>
+                <w:color w:val="FFFFFF" w:themeColor="background1"/>
+              </w:rPr>
+            </w:pPr>
+            <w:r>
+              <w:rPr>
+                <w:rFonts w:cs="Segoe UI"/>
+                <w:b/>
+                <w:bCs/>
+                <w:color w:val="FFFFFF" w:themeColor="background1"/>
+              </w:rPr>
+              <w:t>Excepción</w:t>
+            </w:r>
+          </w:p>
+        </w:tc>
+      </w:tr>
+      <w:tr>
+        <w:trPr>
+          <w:trHeight w:val="457"/>
+        </w:trPr>
+        <w:tc>
+          <w:tcPr>
+            <w:tcW w:w="2952" w:type="dxa"/>
+            <w:tcBorders>
+              <w:top w:val="single" w:sz="4" w:space="0" w:color="808080" w:themeColor="background1" w:themeShade="80"/>
+              <w:bottom w:val="single" w:sz="4" w:space="0" w:color="808080" w:themeColor="background1" w:themeShade="80"/>
+              <w:right w:val="single" w:sz="4" w:space="0" w:color="808080" w:themeColor="background1" w:themeShade="80"/>
+            </w:tcBorders>
+          </w:tcPr>
+          <w:p>
+            <w:pPr>
+              <w:pStyle w:val="Style30"/>
+              <w:numPr>
+                <w:ilvl w:val="0"/>
+                <w:numId w:val="0"/>
+              </w:numPr>
+              <w:rPr>
+                <w:b w:val="0"/>
+                <w:bCs/>
+                <w:lang w:val="en-US"/>
+              </w:rPr>
+            </w:pPr>
+            <w:r>
+              <w:rPr>
+                <w:b w:val="0"/>
+                <w:bCs/>
+                <w:lang w:val="en-US"/>
+              </w:rPr>
+              <w:t>{%tr for paso in fase.pasos</w:t>
+            </w:r>
+            <w:r>
+              <w:rPr>
+                <w:b w:val="0"/>
+                <w:bCs/>
+                <w:lang w:val="en-US"/>
+              </w:rPr>
+              <w:t xml:space="preserve"> %</w:t>
+            </w:r>
+            <w:r>
+              <w:rPr>
+                <w:b w:val="0"/>
+                <w:bCs/>
+                <w:lang w:val="en-US"/>
+              </w:rPr>
+              <w:t>}</w:t>
+            </w:r>
+          </w:p>
+        </w:tc>
+        <w:tc>
+          <w:tcPr>
+            <w:tcW w:w="2250" w:type="dxa"/>
+            <w:tcBorders>
+              <w:top w:val="single" w:sz="4" w:space="0" w:color="808080" w:themeColor="background1" w:themeShade="80"/>
+              <w:left w:val="single" w:sz="4" w:space="0" w:color="808080" w:themeColor="background1" w:themeShade="80"/>
+              <w:bottom w:val="single" w:sz="4" w:space="0" w:color="808080" w:themeColor="background1" w:themeShade="80"/>
+              <w:right w:val="single" w:sz="4" w:space="0" w:color="808080" w:themeColor="background1" w:themeShade="80"/>
+            </w:tcBorders>
+          </w:tcPr>
+          <w:p>
+            <w:pPr>
+              <w:spacing w:before="100" w:beforeAutospacing="1"/>
+              <w:rPr>
+                <w:b/>
+                <w:sz w:val="18"/>
+                <w:szCs w:val="20"/>
+                <w:lang w:val="en-US"/>
+              </w:rPr>
+            </w:pPr>
+          </w:p>
+        </w:tc>
+        <w:tc>
+          <w:tcPr>
+            <w:tcW w:w="2520" w:type="dxa"/>
+            <w:tcBorders>
+              <w:top w:val="single" w:sz="4" w:space="0" w:color="808080" w:themeColor="background1" w:themeShade="80"/>
+              <w:left w:val="single" w:sz="4" w:space="0" w:color="808080" w:themeColor="background1" w:themeShade="80"/>
+              <w:bottom w:val="single" w:sz="4" w:space="0" w:color="808080" w:themeColor="background1" w:themeShade="80"/>
+              <w:right w:val="single" w:sz="4" w:space="0" w:color="808080" w:themeColor="background1" w:themeShade="80"/>
+            </w:tcBorders>
+          </w:tcPr>
+          <w:p>
+            <w:pPr>
+              <w:rPr>
+                <w:b/>
+                <w:sz w:val="18"/>
+                <w:szCs w:val="20"/>
+                <w:lang w:val="en-US"/>
+              </w:rPr>
+            </w:pPr>
+          </w:p>
+        </w:tc>
+        <w:tc>
+          <w:tcPr>
+            <w:tcW w:w="1980" w:type="dxa"/>
+            <w:tcBorders>
+              <w:top w:val="single" w:sz="4" w:space="0" w:color="808080" w:themeColor="background1" w:themeShade="80"/>
+              <w:left w:val="single" w:sz="4" w:space="0" w:color="808080" w:themeColor="background1" w:themeShade="80"/>
+              <w:bottom w:val="single" w:sz="4" w:space="0" w:color="808080" w:themeColor="background1" w:themeShade="80"/>
+              <w:right w:val="single" w:sz="4" w:space="0" w:color="808080" w:themeColor="background1" w:themeShade="80"/>
+            </w:tcBorders>
+          </w:tcPr>
+          <w:p>
+            <w:pPr>
+              <w:jc w:val="left"/>
+              <w:rPr>
+                <w:b/>
+                <w:sz w:val="18"/>
+                <w:szCs w:val="20"/>
+                <w:lang w:val="en-US"/>
+              </w:rPr>
+            </w:pPr>
+          </w:p>
+        </w:tc>
+      </w:tr>
+      <w:tr>
+        <w:trPr>
+          <w:trHeight w:val="80"/>
+        </w:trPr>
+        <w:tc>
+          <w:tcPr>
+            <w:tcW w:w="2952" w:type="dxa"/>
+            <w:tcBorders>
+              <w:top w:val="single" w:sz="4" w:space="0" w:color="808080" w:themeColor="background1" w:themeShade="80"/>
+              <w:bottom w:val="single" w:sz="4" w:space="0" w:color="808080" w:themeColor="background1" w:themeShade="80"/>
+              <w:right w:val="single" w:sz="4" w:space="0" w:color="808080" w:themeColor="background1" w:themeShade="80"/>
+            </w:tcBorders>
+            <w:vAlign w:val="center"/>
+          </w:tcPr>
+          <w:p>
+            <w:pPr>
+              <w:pStyle w:val="Style30"/>
+              <w:numPr>
+                <w:ilvl w:val="0"/>
+                <w:numId w:val="0"/>
+              </w:numPr>
+              <w:spacing w:before="240" w:after="240"/>
+              <w:rPr>
+                <w:color w:val="E37800"/>
+                <w:lang w:val="en-US"/>
+              </w:rPr>
+            </w:pPr>
+            <w:r>
+              <w:rPr>
+                <w:color w:val="E37800"/>
+                <w:sz w:val="22"/>
+                <w:szCs w:val="24"/>
+                <w:lang w:val="en-US"/>
+              </w:rPr>
+              <w:t>{{paso.numero}}</w:t>
+            </w:r>
+          </w:p>
+        </w:tc>
+        <w:tc>
+          <w:tcPr>
+            <w:tcW w:w="2250" w:type="dxa"/>
+            <w:tcBorders>
+              <w:top w:val="single" w:sz="4" w:space="0" w:color="808080" w:themeColor="background1" w:themeShade="80"/>
+              <w:left w:val="single" w:sz="4" w:space="0" w:color="808080" w:themeColor="background1" w:themeShade="80"/>
+              <w:bottom w:val="single" w:sz="4" w:space="0" w:color="808080" w:themeColor="background1" w:themeShade="80"/>
+              <w:right w:val="single" w:sz="4" w:space="0" w:color="808080" w:themeColor="background1" w:themeShade="80"/>
+            </w:tcBorders>
+            <w:vAlign w:val="center"/>
+          </w:tcPr>
+          <w:p>
+            <w:pPr>
+              <w:spacing w:before="240" w:after="240"/>
+              <w:jc w:val="left"/>
+              <w:rPr>
+                <w:bCs/>
+                <w:sz w:val="18"/>
+                <w:szCs w:val="20"/>
+                <w:lang w:val="en-US"/>
+              </w:rPr>
+            </w:pPr>
+            <w:r>
+              <w:rPr>
+                <w:bCs/>
+                <w:sz w:val="18"/>
+                <w:szCs w:val="20"/>
+                <w:lang w:val="en-US"/>
+              </w:rPr>
+              <w:t>{{paso.accion}}</w:t>
+            </w:r>
+          </w:p>
+        </w:tc>
+        <w:tc>
+          <w:tcPr>
+            <w:tcW w:w="2520" w:type="dxa"/>
+            <w:tcBorders>
+              <w:top w:val="single" w:sz="4" w:space="0" w:color="808080" w:themeColor="background1" w:themeShade="80"/>
+              <w:left w:val="single" w:sz="4" w:space="0" w:color="808080" w:themeColor="background1" w:themeShade="80"/>
+              <w:bottom w:val="single" w:sz="4" w:space="0" w:color="808080" w:themeColor="background1" w:themeShade="80"/>
+              <w:right w:val="single" w:sz="4" w:space="0" w:color="808080" w:themeColor="background1" w:themeShade="80"/>
+            </w:tcBorders>
+            <w:vAlign w:val="center"/>
+          </w:tcPr>
+          <w:p>
+            <w:pPr>
+              <w:spacing w:before="240" w:after="240"/>
+              <w:rPr>
+                <w:bCs/>
+                <w:sz w:val="18"/>
+                <w:szCs w:val="20"/>
+                <w:lang w:val="en-US"/>
+              </w:rPr>
+            </w:pPr>
+            <w:r>
+              <w:rPr>
+                <w:bCs/>
+                <w:sz w:val="18"/>
+                <w:szCs w:val="20"/>
+                <w:lang w:val="en-US"/>
+              </w:rPr>
+              <w:t>{{paso.detalle}}</w:t>
+            </w:r>
+          </w:p>
+        </w:tc>
+        <w:tc>
+          <w:tcPr>
+            <w:tcW w:w="1980" w:type="dxa"/>
+            <w:tcBorders>
+              <w:top w:val="single" w:sz="4" w:space="0" w:color="808080" w:themeColor="background1" w:themeShade="80"/>
+              <w:left w:val="single" w:sz="4" w:space="0" w:color="808080" w:themeColor="background1" w:themeShade="80"/>
+              <w:bottom w:val="single" w:sz="4" w:space="0" w:color="808080" w:themeColor="background1" w:themeShade="80"/>
+              <w:right w:val="single" w:sz="4" w:space="0" w:color="808080" w:themeColor="background1" w:themeShade="80"/>
+            </w:tcBorders>
+            <w:vAlign w:val="center"/>
+          </w:tcPr>
+          <w:p>
+            <w:pPr>
+              <w:spacing w:before="240" w:after="240"/>
+              <w:jc w:val="left"/>
+              <w:rPr>
+                <w:bCs/>
+                <w:sz w:val="18"/>
+                <w:szCs w:val="20"/>
+                <w:lang w:val="en-US"/>
+              </w:rPr>
+            </w:pPr>
+            <w:r>
+              <w:rPr>
+                <w:bCs/>
+                <w:sz w:val="18"/>
+                <w:szCs w:val="20"/>
+                <w:lang w:val="en-US"/>
+              </w:rPr>
+              <w:t>{{paso.excepcion</w:t>
+            </w:r>
+            <w:r>
+              <w:rPr>
+                <w:bCs/>
+                <w:sz w:val="18"/>
+                <w:szCs w:val="20"/>
+                <w:lang w:val="en-US"/>
+              </w:rPr>
+              <w:t>es</w:t>
+            </w:r>
+            <w:r>
+              <w:rPr>
+                <w:bCs/>
+                <w:sz w:val="18"/>
+                <w:szCs w:val="20"/>
+                <w:lang w:val="en-US"/>
+              </w:rPr>
+              <w:t>}}</w:t>
+            </w:r>
+          </w:p>
+        </w:tc>
+      </w:tr>
+      <w:tr>
+        <w:trPr>
+          <w:trHeight w:val="457"/>
+        </w:trPr>
+        <w:tc>
+          <w:tcPr>
+            <w:tcW w:w="2952" w:type="dxa"/>
+            <w:tcBorders>
+              <w:top w:val="single" w:sz="4" w:space="0" w:color="808080" w:themeColor="background1" w:themeShade="80"/>
+              <w:bottom w:val="single" w:sz="4" w:space="0" w:color="808080" w:themeColor="background1" w:themeShade="80"/>
+              <w:right w:val="single" w:sz="4" w:space="0" w:color="808080" w:themeColor="background1" w:themeShade="80"/>
+            </w:tcBorders>
+          </w:tcPr>
+          <w:p>
+            <w:pPr>
+              <w:pStyle w:val="Style30"/>
+              <w:numPr>
+                <w:ilvl w:val="0"/>
+                <w:numId w:val="0"/>
+              </w:numPr>
+              <w:rPr>
+                <w:b w:val="0"/>
+                <w:bCs/>
+                <w:lang w:val="en-US"/>
+              </w:rPr>
+            </w:pPr>
+            <w:r>
+              <w:rPr>
+                <w:b w:val="0"/>
+                <w:bCs/>
+                <w:lang w:val="en-US"/>
+              </w:rPr>
+              <w:t>{%tr endfor</w:t>
+            </w:r>
+            <w:r>
+              <w:rPr>
+                <w:b w:val="0"/>
+                <w:bCs/>
+                <w:lang w:val="en-US"/>
+              </w:rPr>
+              <w:t xml:space="preserve"> %</w:t>
+            </w:r>
+            <w:r>
+              <w:rPr>
+                <w:b w:val="0"/>
+                <w:bCs/>
+                <w:lang w:val="en-US"/>
+              </w:rPr>
+              <w:t>}</w:t>
+            </w:r>
+          </w:p>
+        </w:tc>
+        <w:tc>
+          <w:tcPr>
+            <w:tcW w:w="2250" w:type="dxa"/>
+            <w:tcBorders>
+              <w:top w:val="single" w:sz="4" w:space="0" w:color="808080" w:themeColor="background1" w:themeShade="80"/>
+              <w:left w:val="single" w:sz="4" w:space="0" w:color="808080" w:themeColor="background1" w:themeShade="80"/>
+              <w:bottom w:val="single" w:sz="4" w:space="0" w:color="808080" w:themeColor="background1" w:themeShade="80"/>
+              <w:right w:val="single" w:sz="4" w:space="0" w:color="808080" w:themeColor="background1" w:themeShade="80"/>
+            </w:tcBorders>
+          </w:tcPr>
+          <w:p>
+            <w:pPr>
+              <w:spacing w:before="100" w:beforeAutospacing="1"/>
+              <w:rPr>
+                <w:rFonts w:cs="Segoe UI"/>
+                <w:sz w:val="18"/>
+                <w:szCs w:val="18"/>
+                <w:lang w:val="en-US"/>
+              </w:rPr>
+            </w:pPr>
+          </w:p>
+        </w:tc>
+        <w:tc>
+          <w:tcPr>
+            <w:tcW w:w="2520" w:type="dxa"/>
+            <w:tcBorders>
+              <w:top w:val="single" w:sz="4" w:space="0" w:color="808080" w:themeColor="background1" w:themeShade="80"/>
+              <w:left w:val="single" w:sz="4" w:space="0" w:color="808080" w:themeColor="background1" w:themeShade="80"/>
+              <w:bottom w:val="single" w:sz="4" w:space="0" w:color="808080" w:themeColor="background1" w:themeShade="80"/>
+              <w:right w:val="single" w:sz="4" w:space="0" w:color="808080" w:themeColor="background1" w:themeShade="80"/>
+            </w:tcBorders>
+          </w:tcPr>
+          <w:p>
+            <w:pPr>
+              <w:rPr>
+                <w:sz w:val="18"/>
+                <w:szCs w:val="18"/>
+                <w:lang w:val="pt-PT"/>
+              </w:rPr>
+            </w:pPr>
+          </w:p>
+        </w:tc>
+        <w:tc>
+          <w:tcPr>
+            <w:tcW w:w="1980" w:type="dxa"/>
+            <w:tcBorders>
+              <w:top w:val="single" w:sz="4" w:space="0" w:color="808080" w:themeColor="background1" w:themeShade="80"/>
+              <w:left w:val="single" w:sz="4" w:space="0" w:color="808080" w:themeColor="background1" w:themeShade="80"/>
+              <w:bottom w:val="single" w:sz="4" w:space="0" w:color="808080" w:themeColor="background1" w:themeShade="80"/>
+              <w:right w:val="single" w:sz="4" w:space="0" w:color="808080" w:themeColor="background1" w:themeShade="80"/>
+            </w:tcBorders>
+          </w:tcPr>
+          <w:p>
+            <w:pPr>
+              <w:jc w:val="left"/>
+              <w:rPr>
+                <w:rFonts w:cs="Segoe UI"/>
+                <w:lang w:val="pt-PT"/>
+              </w:rPr>
+            </w:pPr>
+          </w:p>
+        </w:tc>
+      </w:tr>
+    </w:tbl>
     <w:p>
       <w:pPr>
         <w:rPr>
@@ -6198,24 +6506,8 @@
         <w:rPr>
           <w:lang w:val="en-US" w:eastAsia="en-US"/>
         </w:rPr>
-        <w:t xml:space="preserve">{%p </w:t>
+        <w:t>{%p endfor %}</w:t>
       </w:r>
-      <w:proofErr w:type="spellStart"/>
-      <w:proofErr w:type="gramStart"/>
-      <w:r>
-        <w:rPr>
-          <w:lang w:val="en-US" w:eastAsia="en-US"/>
-        </w:rPr>
-        <w:t>endfor</w:t>
-      </w:r>
-      <w:proofErr w:type="spellEnd"/>
-      <w:r>
-        <w:rPr>
-          <w:lang w:val="en-US" w:eastAsia="en-US"/>
-        </w:rPr>
-        <w:t xml:space="preserve"> %}</w:t>
-      </w:r>
-      <w:proofErr w:type="gramEnd"/>
     </w:p>
     <w:bookmarkEnd w:id="36"/>
     <w:p>
@@ -6472,23 +6764,7 @@
                 <w:color w:val="7E7E7E"/>
                 <w:sz w:val="18"/>
               </w:rPr>
-              <w:t>{{</w:t>
-            </w:r>
-            <w:proofErr w:type="spellStart"/>
-            <w:r>
-              <w:rPr>
-                <w:color w:val="7E7E7E"/>
-                <w:sz w:val="18"/>
-              </w:rPr>
-              <w:t>codigoBot</w:t>
-            </w:r>
-            <w:proofErr w:type="spellEnd"/>
-            <w:r>
-              <w:rPr>
-                <w:color w:val="7E7E7E"/>
-                <w:sz w:val="18"/>
-              </w:rPr>
-              <w:t xml:space="preserve">}} </w:t>
+              <w:t xml:space="preserve">{{codigoBot}} </w:t>
             </w:r>
             <w:r>
               <w:rPr>
@@ -6690,23 +6966,7 @@
                 <w:color w:val="7E7E7E"/>
                 <w:sz w:val="18"/>
               </w:rPr>
-              <w:t>{{</w:t>
-            </w:r>
-            <w:proofErr w:type="spellStart"/>
-            <w:r>
-              <w:rPr>
-                <w:color w:val="7E7E7E"/>
-                <w:sz w:val="18"/>
-              </w:rPr>
-              <w:t>codigoBot</w:t>
-            </w:r>
-            <w:proofErr w:type="spellEnd"/>
-            <w:r>
-              <w:rPr>
-                <w:color w:val="7E7E7E"/>
-                <w:sz w:val="18"/>
-              </w:rPr>
-              <w:t>}}</w:t>
+              <w:t>{{codigoBot}}</w:t>
             </w:r>
             <w:r>
               <w:rPr>
@@ -6850,23 +7110,7 @@
                 <w:color w:val="7E7E7E"/>
                 <w:sz w:val="18"/>
               </w:rPr>
-              <w:t>{{</w:t>
-            </w:r>
-            <w:proofErr w:type="spellStart"/>
-            <w:r>
-              <w:rPr>
-                <w:color w:val="7E7E7E"/>
-                <w:sz w:val="18"/>
-              </w:rPr>
-              <w:t>codigoBot</w:t>
-            </w:r>
-            <w:proofErr w:type="spellEnd"/>
-            <w:r>
-              <w:rPr>
-                <w:color w:val="7E7E7E"/>
-                <w:sz w:val="18"/>
-              </w:rPr>
-              <w:t>}}</w:t>
+              <w:t>{{codigoBot}}</w:t>
             </w:r>
             <w:r>
               <w:rPr>
@@ -6912,23 +7156,7 @@
                 <w:color w:val="7E7E7E"/>
                 <w:sz w:val="18"/>
               </w:rPr>
-              <w:t>{{</w:t>
-            </w:r>
-            <w:proofErr w:type="spellStart"/>
-            <w:r>
-              <w:rPr>
-                <w:color w:val="7E7E7E"/>
-                <w:sz w:val="18"/>
-              </w:rPr>
-              <w:t>codigoBot</w:t>
-            </w:r>
-            <w:proofErr w:type="spellEnd"/>
-            <w:r>
-              <w:rPr>
-                <w:color w:val="7E7E7E"/>
-                <w:sz w:val="18"/>
-              </w:rPr>
-              <w:t xml:space="preserve">}} </w:t>
+              <w:t xml:space="preserve">{{codigoBot}} </w:t>
             </w:r>
             <w:r>
               <w:rPr>
@@ -7255,23 +7483,7 @@
                 <w:color w:val="7E7E7E"/>
                 <w:sz w:val="18"/>
               </w:rPr>
-              <w:t>{{</w:t>
-            </w:r>
-            <w:proofErr w:type="spellStart"/>
-            <w:r>
-              <w:rPr>
-                <w:color w:val="7E7E7E"/>
-                <w:sz w:val="18"/>
-              </w:rPr>
-              <w:t>codigoBot</w:t>
-            </w:r>
-            <w:proofErr w:type="spellEnd"/>
-            <w:r>
-              <w:rPr>
-                <w:color w:val="7E7E7E"/>
-                <w:sz w:val="18"/>
-              </w:rPr>
-              <w:t>}}</w:t>
+              <w:t>{{codigoBot}}</w:t>
             </w:r>
             <w:r>
               <w:rPr>
@@ -7597,6 +7809,7 @@
     <w:p>
       <w:pPr>
         <w:pStyle w:val="BodyText"/>
+        <w:spacing w:after="240"/>
         <w:rPr>
           <w:rFonts w:eastAsia="Segoe UI"/>
           <w:i/>
@@ -7614,13 +7827,13 @@
     </w:p>
     <w:tbl>
       <w:tblPr>
-        <w:tblW w:w="9248" w:type="dxa"/>
+        <w:tblW w:w="9612" w:type="dxa"/>
         <w:tblInd w:w="108" w:type="dxa"/>
         <w:tblLook w:val="01E0" w:firstRow="1" w:lastRow="1" w:firstColumn="1" w:lastColumn="1" w:noHBand="0" w:noVBand="0"/>
       </w:tblPr>
       <w:tblGrid>
-        <w:gridCol w:w="1310"/>
-        <w:gridCol w:w="7938"/>
+        <w:gridCol w:w="882"/>
+        <w:gridCol w:w="8730"/>
       </w:tblGrid>
       <w:tr>
         <w:trPr>
@@ -7628,7 +7841,7 @@
         </w:trPr>
         <w:tc>
           <w:tcPr>
-            <w:tcW w:w="1310" w:type="dxa"/>
+            <w:tcW w:w="882" w:type="dxa"/>
             <w:tcBorders>
               <w:right w:val="single" w:sz="8" w:space="0" w:color="FFFFFF" w:themeColor="background1"/>
             </w:tcBorders>
@@ -7657,7 +7870,7 @@
         </w:tc>
         <w:tc>
           <w:tcPr>
-            <w:tcW w:w="7938" w:type="dxa"/>
+            <w:tcW w:w="8730" w:type="dxa"/>
             <w:tcBorders>
               <w:left w:val="single" w:sz="8" w:space="0" w:color="FFFFFF" w:themeColor="background1"/>
               <w:right w:val="single" w:sz="8" w:space="0" w:color="FFFFFF" w:themeColor="background1"/>
@@ -7710,7 +7923,7 @@
         </w:trPr>
         <w:tc>
           <w:tcPr>
-            <w:tcW w:w="1310" w:type="dxa"/>
+            <w:tcW w:w="882" w:type="dxa"/>
             <w:tcBorders>
               <w:top w:val="single" w:sz="8" w:space="0" w:color="7F7F7F" w:themeColor="text1" w:themeTint="80"/>
               <w:bottom w:val="single" w:sz="8" w:space="0" w:color="7F7F7F" w:themeColor="text1" w:themeTint="80"/>
@@ -7720,12 +7933,13 @@
           <w:p>
             <w:pPr>
               <w:pStyle w:val="Style30"/>
+              <w:ind w:left="690"/>
             </w:pPr>
           </w:p>
         </w:tc>
         <w:tc>
           <w:tcPr>
-            <w:tcW w:w="7938" w:type="dxa"/>
+            <w:tcW w:w="8730" w:type="dxa"/>
             <w:tcBorders>
               <w:top w:val="single" w:sz="8" w:space="0" w:color="7F7F7F" w:themeColor="text1" w:themeTint="80"/>
               <w:left w:val="single" w:sz="8" w:space="0" w:color="7F7F7F" w:themeColor="text1" w:themeTint="80"/>
@@ -7791,7 +8005,7 @@
         </w:trPr>
         <w:tc>
           <w:tcPr>
-            <w:tcW w:w="1310" w:type="dxa"/>
+            <w:tcW w:w="882" w:type="dxa"/>
             <w:tcBorders>
               <w:top w:val="single" w:sz="8" w:space="0" w:color="7F7F7F" w:themeColor="text1" w:themeTint="80"/>
               <w:bottom w:val="single" w:sz="8" w:space="0" w:color="7F7F7F" w:themeColor="text1" w:themeTint="80"/>
@@ -7801,12 +8015,13 @@
           <w:p>
             <w:pPr>
               <w:pStyle w:val="Style30"/>
+              <w:ind w:left="690"/>
             </w:pPr>
           </w:p>
         </w:tc>
         <w:tc>
           <w:tcPr>
-            <w:tcW w:w="7938" w:type="dxa"/>
+            <w:tcW w:w="8730" w:type="dxa"/>
             <w:tcBorders>
               <w:top w:val="single" w:sz="8" w:space="0" w:color="7F7F7F" w:themeColor="text1" w:themeTint="80"/>
               <w:left w:val="single" w:sz="8" w:space="0" w:color="7F7F7F" w:themeColor="text1" w:themeTint="80"/>
@@ -7918,15 +8133,15 @@
     </w:p>
     <w:tbl>
       <w:tblPr>
-        <w:tblW w:w="9328" w:type="dxa"/>
+        <w:tblW w:w="9648" w:type="dxa"/>
         <w:tblInd w:w="108" w:type="dxa"/>
         <w:tblLayout w:type="fixed"/>
         <w:tblLook w:val="01E0" w:firstRow="1" w:lastRow="1" w:firstColumn="1" w:lastColumn="1" w:noHBand="0" w:noVBand="0"/>
       </w:tblPr>
       <w:tblGrid>
-        <w:gridCol w:w="743"/>
-        <w:gridCol w:w="1399"/>
-        <w:gridCol w:w="7186"/>
+        <w:gridCol w:w="3132"/>
+        <w:gridCol w:w="2970"/>
+        <w:gridCol w:w="3546"/>
       </w:tblGrid>
       <w:tr>
         <w:trPr>
@@ -7935,7 +8150,7 @@
         </w:trPr>
         <w:tc>
           <w:tcPr>
-            <w:tcW w:w="743" w:type="dxa"/>
+            <w:tcW w:w="3132" w:type="dxa"/>
             <w:tcBorders>
               <w:right w:val="single" w:sz="8" w:space="0" w:color="FFFFFF" w:themeColor="background1"/>
             </w:tcBorders>
@@ -7964,7 +8179,7 @@
         </w:tc>
         <w:tc>
           <w:tcPr>
-            <w:tcW w:w="1399" w:type="dxa"/>
+            <w:tcW w:w="2970" w:type="dxa"/>
             <w:tcBorders>
               <w:left w:val="single" w:sz="8" w:space="0" w:color="FFFFFF" w:themeColor="background1"/>
               <w:right w:val="single" w:sz="8" w:space="0" w:color="FFFFFF" w:themeColor="background1"/>
@@ -7988,7 +8203,7 @@
         </w:tc>
         <w:tc>
           <w:tcPr>
-            <w:tcW w:w="7186" w:type="dxa"/>
+            <w:tcW w:w="3546" w:type="dxa"/>
             <w:tcBorders>
               <w:left w:val="single" w:sz="8" w:space="0" w:color="FFFFFF" w:themeColor="background1"/>
               <w:right w:val="single" w:sz="8" w:space="0" w:color="FFFFFF" w:themeColor="background1"/>
@@ -8023,7 +8238,7 @@
         </w:trPr>
         <w:tc>
           <w:tcPr>
-            <w:tcW w:w="743" w:type="dxa"/>
+            <w:tcW w:w="3132" w:type="dxa"/>
             <w:tcBorders>
               <w:top w:val="single" w:sz="8" w:space="0" w:color="7F7F7F" w:themeColor="text1" w:themeTint="80"/>
               <w:bottom w:val="single" w:sz="8" w:space="0" w:color="7F7F7F" w:themeColor="text1" w:themeTint="80"/>
@@ -8033,12 +8248,52 @@
           <w:p>
             <w:pPr>
               <w:pStyle w:val="Style30"/>
-            </w:pPr>
+              <w:numPr>
+                <w:ilvl w:val="0"/>
+                <w:numId w:val="0"/>
+              </w:numPr>
+              <w:rPr>
+                <w:b w:val="0"/>
+                <w:bCs/>
+              </w:rPr>
+            </w:pPr>
+            <w:r>
+              <w:rPr>
+                <w:rFonts w:cs="Segoe UI"/>
+                <w:b w:val="0"/>
+                <w:bCs/>
+                <w:sz w:val="20"/>
+                <w:lang w:val="en-US"/>
+              </w:rPr>
+              <w:t xml:space="preserve">{%tr for e in </w:t>
+            </w:r>
+            <w:proofErr w:type="spellStart"/>
+            <w:r>
+              <w:rPr>
+                <w:rFonts w:cs="Segoe UI"/>
+                <w:b w:val="0"/>
+                <w:bCs/>
+                <w:sz w:val="20"/>
+                <w:lang w:val="en-US"/>
+              </w:rPr>
+              <w:t>excepcionesSys</w:t>
+            </w:r>
+            <w:proofErr w:type="spellEnd"/>
+            <w:r>
+              <w:rPr>
+                <w:rFonts w:cs="Segoe UI"/>
+                <w:b w:val="0"/>
+                <w:bCs/>
+                <w:sz w:val="20"/>
+                <w:lang w:val="en-US"/>
+              </w:rPr>
+              <w:t xml:space="preserve"> %}</w:t>
+            </w:r>
           </w:p>
         </w:tc>
         <w:tc>
           <w:tcPr>
-            <w:tcW w:w="1399" w:type="dxa"/>
+            <w:tcW w:w="2970" w:type="dxa"/>
             <w:tcBorders>
               <w:top w:val="single" w:sz="8" w:space="0" w:color="7F7F7F" w:themeColor="text1" w:themeTint="80"/>
               <w:left w:val="single" w:sz="8" w:space="0" w:color="7F7F7F" w:themeColor="text1" w:themeTint="80"/>
@@ -8055,58 +8310,11 @@
                 <w:lang w:val="en-US"/>
               </w:rPr>
             </w:pPr>
-            <w:r>
-              <w:rPr>
-                <w:rFonts w:cs="Segoe UI"/>
-                <w:sz w:val="20"/>
-                <w:szCs w:val="20"/>
-                <w:lang w:val="en-US"/>
-              </w:rPr>
-              <w:t xml:space="preserve">{%tr for </w:t>
-            </w:r>
-            <w:r>
-              <w:rPr>
-                <w:rFonts w:cs="Segoe UI"/>
-                <w:sz w:val="20"/>
-                <w:szCs w:val="20"/>
-                <w:lang w:val="en-US"/>
-              </w:rPr>
-              <w:t>e</w:t>
-            </w:r>
-            <w:r>
-              <w:rPr>
-                <w:rFonts w:cs="Segoe UI"/>
-                <w:sz w:val="20"/>
-                <w:szCs w:val="20"/>
-                <w:lang w:val="en-US"/>
-              </w:rPr>
-              <w:t xml:space="preserve"> in </w:t>
-            </w:r>
-            <w:proofErr w:type="spellStart"/>
-            <w:r>
-              <w:rPr>
-                <w:rFonts w:cs="Segoe UI"/>
-                <w:sz w:val="20"/>
-                <w:szCs w:val="20"/>
-                <w:lang w:val="en-US"/>
-              </w:rPr>
-              <w:t>excepcionesSys</w:t>
-            </w:r>
-            <w:proofErr w:type="spellEnd"/>
-            <w:r>
-              <w:rPr>
-                <w:rFonts w:cs="Segoe UI"/>
-                <w:sz w:val="20"/>
-                <w:szCs w:val="20"/>
-                <w:lang w:val="en-US"/>
-              </w:rPr>
-              <w:t xml:space="preserve"> %}</w:t>
-            </w:r>
           </w:p>
         </w:tc>
         <w:tc>
           <w:tcPr>
-            <w:tcW w:w="7186" w:type="dxa"/>
+            <w:tcW w:w="3546" w:type="dxa"/>
             <w:tcBorders>
               <w:top w:val="single" w:sz="8" w:space="0" w:color="7F7F7F" w:themeColor="text1" w:themeTint="80"/>
               <w:left w:val="single" w:sz="8" w:space="0" w:color="7F7F7F" w:themeColor="text1" w:themeTint="80"/>
@@ -8133,7 +8341,7 @@
         </w:trPr>
         <w:tc>
           <w:tcPr>
-            <w:tcW w:w="743" w:type="dxa"/>
+            <w:tcW w:w="3132" w:type="dxa"/>
             <w:tcBorders>
               <w:top w:val="single" w:sz="8" w:space="0" w:color="7F7F7F" w:themeColor="text1" w:themeTint="80"/>
               <w:bottom w:val="single" w:sz="8" w:space="0" w:color="7F7F7F" w:themeColor="text1" w:themeTint="80"/>
@@ -8143,15 +8351,29 @@
           <w:p>
             <w:pPr>
               <w:pStyle w:val="Style30"/>
+              <w:numPr>
+                <w:ilvl w:val="0"/>
+                <w:numId w:val="0"/>
+              </w:numPr>
+              <w:spacing w:before="240" w:after="240"/>
               <w:rPr>
                 <w:lang w:val="en-US"/>
               </w:rPr>
             </w:pPr>
+            <w:r>
+              <w:rPr>
+                <w:color w:val="E37800"/>
+                <w:sz w:val="22"/>
+                <w:szCs w:val="22"/>
+                <w:lang w:val="en-US"/>
+              </w:rPr>
+              <w:t>{{e.numero}}</w:t>
+            </w:r>
           </w:p>
         </w:tc>
         <w:tc>
           <w:tcPr>
-            <w:tcW w:w="1399" w:type="dxa"/>
+            <w:tcW w:w="2970" w:type="dxa"/>
             <w:tcBorders>
               <w:top w:val="single" w:sz="8" w:space="0" w:color="7F7F7F" w:themeColor="text1" w:themeTint="80"/>
               <w:left w:val="single" w:sz="8" w:space="0" w:color="7F7F7F" w:themeColor="text1" w:themeTint="80"/>
@@ -8161,7 +8383,7 @@
           </w:tcPr>
           <w:p>
             <w:pPr>
-              <w:spacing w:before="80"/>
+              <w:spacing w:before="240" w:after="240"/>
               <w:jc w:val="center"/>
               <w:rPr>
                 <w:sz w:val="18"/>
@@ -8199,7 +8421,7 @@
         </w:tc>
         <w:tc>
           <w:tcPr>
-            <w:tcW w:w="7186" w:type="dxa"/>
+            <w:tcW w:w="3546" w:type="dxa"/>
             <w:tcBorders>
               <w:top w:val="single" w:sz="8" w:space="0" w:color="7F7F7F" w:themeColor="text1" w:themeTint="80"/>
               <w:left w:val="single" w:sz="8" w:space="0" w:color="7F7F7F" w:themeColor="text1" w:themeTint="80"/>
@@ -8209,7 +8431,7 @@
           </w:tcPr>
           <w:p>
             <w:pPr>
-              <w:spacing w:before="80"/>
+              <w:spacing w:before="240" w:after="240"/>
               <w:rPr>
                 <w:rFonts w:cs="Segoe UI"/>
                 <w:sz w:val="18"/>
@@ -8255,7 +8477,7 @@
         </w:trPr>
         <w:tc>
           <w:tcPr>
-            <w:tcW w:w="743" w:type="dxa"/>
+            <w:tcW w:w="3132" w:type="dxa"/>
             <w:tcBorders>
               <w:top w:val="single" w:sz="8" w:space="0" w:color="7F7F7F" w:themeColor="text1" w:themeTint="80"/>
               <w:bottom w:val="single" w:sz="8" w:space="0" w:color="7F7F7F" w:themeColor="text1" w:themeTint="80"/>
@@ -8265,15 +8487,50 @@
           <w:p>
             <w:pPr>
               <w:pStyle w:val="Style30"/>
-              <w:rPr>
+              <w:numPr>
+                <w:ilvl w:val="0"/>
+                <w:numId w:val="0"/>
+              </w:numPr>
+              <w:rPr>
+                <w:b w:val="0"/>
+                <w:bCs/>
                 <w:lang w:val="en-US"/>
               </w:rPr>
             </w:pPr>
+            <w:r>
+              <w:rPr>
+                <w:rFonts w:cs="Segoe UI"/>
+                <w:b w:val="0"/>
+                <w:bCs/>
+                <w:sz w:val="20"/>
+              </w:rPr>
+              <w:t>{%</w:t>
+            </w:r>
+            <w:proofErr w:type="spellStart"/>
+            <w:r>
+              <w:rPr>
+                <w:rFonts w:cs="Segoe UI"/>
+                <w:b w:val="0"/>
+                <w:bCs/>
+                <w:sz w:val="20"/>
+              </w:rPr>
+              <w:t>tr</w:t>
+            </w:r>
+            <w:proofErr w:type="spellEnd"/>
+            <w:r>
+              <w:rPr>
+                <w:rFonts w:cs="Segoe UI"/>
+                <w:b w:val="0"/>
+                <w:bCs/>
+                <w:sz w:val="20"/>
+              </w:rPr>
+              <w:t xml:space="preserve"> endfor %}</w:t>
+            </w:r>
           </w:p>
         </w:tc>
         <w:tc>
           <w:tcPr>
-            <w:tcW w:w="1399" w:type="dxa"/>
+            <w:tcW w:w="2970" w:type="dxa"/>
             <w:tcBorders>
               <w:top w:val="single" w:sz="8" w:space="0" w:color="7F7F7F" w:themeColor="text1" w:themeTint="80"/>
               <w:left w:val="single" w:sz="8" w:space="0" w:color="7F7F7F" w:themeColor="text1" w:themeTint="80"/>
@@ -8290,55 +8547,11 @@
                 <w:lang w:val="en-US"/>
               </w:rPr>
             </w:pPr>
-            <w:r>
-              <w:rPr>
-                <w:rFonts w:cs="Segoe UI"/>
-                <w:sz w:val="20"/>
-                <w:szCs w:val="20"/>
-              </w:rPr>
-              <w:t>{%</w:t>
-            </w:r>
-            <w:proofErr w:type="spellStart"/>
-            <w:r>
-              <w:rPr>
-                <w:rFonts w:cs="Segoe UI"/>
-                <w:sz w:val="20"/>
-                <w:szCs w:val="20"/>
-              </w:rPr>
-              <w:t>tr</w:t>
-            </w:r>
-            <w:proofErr w:type="spellEnd"/>
-            <w:r>
-              <w:rPr>
-                <w:rFonts w:cs="Segoe UI"/>
-                <w:sz w:val="20"/>
-                <w:szCs w:val="20"/>
-              </w:rPr>
-              <w:t xml:space="preserve"> </w:t>
-            </w:r>
-            <w:proofErr w:type="spellStart"/>
-            <w:r>
-              <w:rPr>
-                <w:rFonts w:cs="Segoe UI"/>
-                <w:sz w:val="20"/>
-                <w:szCs w:val="20"/>
-              </w:rPr>
-              <w:t>endfor</w:t>
-            </w:r>
-            <w:proofErr w:type="spellEnd"/>
-            <w:r>
-              <w:rPr>
-                <w:rFonts w:cs="Segoe UI"/>
-                <w:sz w:val="20"/>
-                <w:szCs w:val="20"/>
-              </w:rPr>
-              <w:t xml:space="preserve"> %}</w:t>
-            </w:r>
           </w:p>
         </w:tc>
         <w:tc>
           <w:tcPr>
-            <w:tcW w:w="7186" w:type="dxa"/>
+            <w:tcW w:w="3546" w:type="dxa"/>
             <w:tcBorders>
               <w:top w:val="single" w:sz="8" w:space="0" w:color="7F7F7F" w:themeColor="text1" w:themeTint="80"/>
               <w:left w:val="single" w:sz="8" w:space="0" w:color="7F7F7F" w:themeColor="text1" w:themeTint="80"/>
@@ -8401,15 +8614,15 @@
     </w:p>
     <w:tbl>
       <w:tblPr>
-        <w:tblW w:w="9328" w:type="dxa"/>
+        <w:tblW w:w="9702" w:type="dxa"/>
         <w:tblInd w:w="108" w:type="dxa"/>
         <w:tblLayout w:type="fixed"/>
         <w:tblLook w:val="01E0" w:firstRow="1" w:lastRow="1" w:firstColumn="1" w:lastColumn="1" w:noHBand="0" w:noVBand="0"/>
       </w:tblPr>
       <w:tblGrid>
-        <w:gridCol w:w="743"/>
-        <w:gridCol w:w="1417"/>
-        <w:gridCol w:w="7168"/>
+        <w:gridCol w:w="3132"/>
+        <w:gridCol w:w="2970"/>
+        <w:gridCol w:w="3600"/>
       </w:tblGrid>
       <w:tr>
         <w:trPr>
@@ -8418,7 +8631,7 @@
         </w:trPr>
         <w:tc>
           <w:tcPr>
-            <w:tcW w:w="743" w:type="dxa"/>
+            <w:tcW w:w="3132" w:type="dxa"/>
             <w:tcBorders>
               <w:right w:val="single" w:sz="8" w:space="0" w:color="FFFFFF" w:themeColor="background1"/>
             </w:tcBorders>
@@ -8447,7 +8660,7 @@
         </w:tc>
         <w:tc>
           <w:tcPr>
-            <w:tcW w:w="1417" w:type="dxa"/>
+            <w:tcW w:w="2970" w:type="dxa"/>
             <w:tcBorders>
               <w:left w:val="single" w:sz="8" w:space="0" w:color="FFFFFF" w:themeColor="background1"/>
               <w:right w:val="single" w:sz="8" w:space="0" w:color="FFFFFF" w:themeColor="background1"/>
@@ -8471,7 +8684,7 @@
         </w:tc>
         <w:tc>
           <w:tcPr>
-            <w:tcW w:w="7168" w:type="dxa"/>
+            <w:tcW w:w="3600" w:type="dxa"/>
             <w:tcBorders>
               <w:left w:val="single" w:sz="8" w:space="0" w:color="FFFFFF" w:themeColor="background1"/>
               <w:right w:val="single" w:sz="8" w:space="0" w:color="FFFFFF" w:themeColor="background1"/>
@@ -8506,7 +8719,7 @@
         </w:trPr>
         <w:tc>
           <w:tcPr>
-            <w:tcW w:w="743" w:type="dxa"/>
+            <w:tcW w:w="3132" w:type="dxa"/>
             <w:tcBorders>
               <w:top w:val="single" w:sz="8" w:space="0" w:color="7F7F7F" w:themeColor="text1" w:themeTint="80"/>
               <w:bottom w:val="single" w:sz="8" w:space="0" w:color="7F7F7F" w:themeColor="text1" w:themeTint="80"/>
@@ -8516,13 +8729,59 @@
           <w:p>
             <w:pPr>
               <w:pStyle w:val="Style30"/>
+              <w:numPr>
+                <w:ilvl w:val="0"/>
+                <w:numId w:val="0"/>
+              </w:numPr>
             </w:pPr>
             <w:bookmarkStart w:id="55" w:name="N_4_2_2_No_encontramos_campos" w:colFirst="1" w:colLast="1"/>
+            <w:r>
+              <w:rPr>
+                <w:rFonts w:cs="Segoe UI"/>
+                <w:sz w:val="20"/>
+                <w:lang w:val="en-US"/>
+              </w:rPr>
+              <w:t xml:space="preserve">{%tr for </w:t>
+            </w:r>
+            <w:r>
+              <w:rPr>
+                <w:rFonts w:cs="Segoe UI"/>
+                <w:sz w:val="20"/>
+                <w:lang w:val="en-US"/>
+              </w:rPr>
+              <w:t>e</w:t>
+            </w:r>
+            <w:r>
+              <w:rPr>
+                <w:rFonts w:cs="Segoe UI"/>
+                <w:sz w:val="20"/>
+                <w:lang w:val="en-US"/>
+              </w:rPr>
+              <w:t xml:space="preserve"> in </w:t>
+            </w:r>
+            <w:proofErr w:type="spellStart"/>
+            <w:r>
+              <w:rPr>
+                <w:rFonts w:cs="Segoe UI"/>
+                <w:sz w:val="20"/>
+                <w:lang w:val="en-US"/>
+              </w:rPr>
+              <w:t>excepcionesNeg</w:t>
+            </w:r>
+            <w:proofErr w:type="spellEnd"/>
+            <w:r>
+              <w:rPr>
+                <w:rFonts w:cs="Segoe UI"/>
+                <w:sz w:val="20"/>
+                <w:lang w:val="en-US"/>
+              </w:rPr>
+              <w:t xml:space="preserve"> %}</w:t>
+            </w:r>
           </w:p>
         </w:tc>
         <w:tc>
           <w:tcPr>
-            <w:tcW w:w="1417" w:type="dxa"/>
+            <w:tcW w:w="2970" w:type="dxa"/>
             <w:tcBorders>
               <w:top w:val="single" w:sz="8" w:space="0" w:color="7F7F7F" w:themeColor="text1" w:themeTint="80"/>
               <w:left w:val="single" w:sz="8" w:space="0" w:color="7F7F7F" w:themeColor="text1" w:themeTint="80"/>
@@ -8539,58 +8798,11 @@
                 <w:szCs w:val="18"/>
               </w:rPr>
             </w:pPr>
-            <w:r>
-              <w:rPr>
-                <w:rFonts w:cs="Segoe UI"/>
-                <w:sz w:val="20"/>
-                <w:szCs w:val="20"/>
-                <w:lang w:val="en-US"/>
-              </w:rPr>
-              <w:t xml:space="preserve">{%tr for </w:t>
-            </w:r>
-            <w:r>
-              <w:rPr>
-                <w:rFonts w:cs="Segoe UI"/>
-                <w:sz w:val="20"/>
-                <w:szCs w:val="20"/>
-                <w:lang w:val="en-US"/>
-              </w:rPr>
-              <w:t>e</w:t>
-            </w:r>
-            <w:r>
-              <w:rPr>
-                <w:rFonts w:cs="Segoe UI"/>
-                <w:sz w:val="20"/>
-                <w:szCs w:val="20"/>
-                <w:lang w:val="en-US"/>
-              </w:rPr>
-              <w:t xml:space="preserve"> in </w:t>
-            </w:r>
-            <w:proofErr w:type="spellStart"/>
-            <w:r>
-              <w:rPr>
-                <w:rFonts w:cs="Segoe UI"/>
-                <w:sz w:val="20"/>
-                <w:szCs w:val="20"/>
-                <w:lang w:val="en-US"/>
-              </w:rPr>
-              <w:t>excepcionesNeg</w:t>
-            </w:r>
-            <w:proofErr w:type="spellEnd"/>
-            <w:r>
-              <w:rPr>
-                <w:rFonts w:cs="Segoe UI"/>
-                <w:sz w:val="20"/>
-                <w:szCs w:val="20"/>
-                <w:lang w:val="en-US"/>
-              </w:rPr>
-              <w:t xml:space="preserve"> %}</w:t>
-            </w:r>
           </w:p>
         </w:tc>
         <w:tc>
           <w:tcPr>
-            <w:tcW w:w="7168" w:type="dxa"/>
+            <w:tcW w:w="3600" w:type="dxa"/>
             <w:tcBorders>
               <w:top w:val="single" w:sz="8" w:space="0" w:color="7F7F7F" w:themeColor="text1" w:themeTint="80"/>
               <w:left w:val="single" w:sz="8" w:space="0" w:color="7F7F7F" w:themeColor="text1" w:themeTint="80"/>
@@ -8617,32 +8829,47 @@
         </w:trPr>
         <w:tc>
           <w:tcPr>
-            <w:tcW w:w="743" w:type="dxa"/>
+            <w:tcW w:w="3132" w:type="dxa"/>
             <w:tcBorders>
               <w:top w:val="single" w:sz="8" w:space="0" w:color="7F7F7F" w:themeColor="text1" w:themeTint="80"/>
               <w:bottom w:val="single" w:sz="8" w:space="0" w:color="7F7F7F" w:themeColor="text1" w:themeTint="80"/>
               <w:right w:val="single" w:sz="8" w:space="0" w:color="7F7F7F" w:themeColor="text1" w:themeTint="80"/>
             </w:tcBorders>
+            <w:vAlign w:val="center"/>
           </w:tcPr>
           <w:p>
             <w:pPr>
               <w:pStyle w:val="Style30"/>
-            </w:pPr>
+              <w:numPr>
+                <w:ilvl w:val="0"/>
+                <w:numId w:val="0"/>
+              </w:numPr>
+              <w:spacing w:before="240" w:after="240"/>
+            </w:pPr>
+            <w:r>
+              <w:rPr>
+                <w:color w:val="E37800"/>
+                <w:sz w:val="22"/>
+                <w:szCs w:val="24"/>
+              </w:rPr>
+              <w:t>{{e.numero}}</w:t>
+            </w:r>
           </w:p>
         </w:tc>
         <w:tc>
           <w:tcPr>
-            <w:tcW w:w="1417" w:type="dxa"/>
+            <w:tcW w:w="2970" w:type="dxa"/>
             <w:tcBorders>
               <w:top w:val="single" w:sz="8" w:space="0" w:color="7F7F7F" w:themeColor="text1" w:themeTint="80"/>
               <w:left w:val="single" w:sz="8" w:space="0" w:color="7F7F7F" w:themeColor="text1" w:themeTint="80"/>
               <w:bottom w:val="single" w:sz="8" w:space="0" w:color="7F7F7F" w:themeColor="text1" w:themeTint="80"/>
               <w:right w:val="single" w:sz="8" w:space="0" w:color="7F7F7F" w:themeColor="text1" w:themeTint="80"/>
             </w:tcBorders>
+            <w:vAlign w:val="center"/>
           </w:tcPr>
           <w:p>
             <w:pPr>
-              <w:spacing w:before="80"/>
+              <w:spacing w:before="240" w:after="240"/>
               <w:jc w:val="left"/>
               <w:rPr>
                 <w:color w:val="7E7E7E"/>
@@ -8676,20 +8903,20 @@
         </w:tc>
         <w:tc>
           <w:tcPr>
-            <w:tcW w:w="7168" w:type="dxa"/>
+            <w:tcW w:w="3600" w:type="dxa"/>
             <w:tcBorders>
               <w:top w:val="single" w:sz="8" w:space="0" w:color="7F7F7F" w:themeColor="text1" w:themeTint="80"/>
               <w:left w:val="single" w:sz="8" w:space="0" w:color="7F7F7F" w:themeColor="text1" w:themeTint="80"/>
               <w:bottom w:val="single" w:sz="8" w:space="0" w:color="7F7F7F" w:themeColor="text1" w:themeTint="80"/>
               <w:right w:val="single" w:sz="8" w:space="0" w:color="7F7F7F" w:themeColor="text1" w:themeTint="80"/>
             </w:tcBorders>
+            <w:vAlign w:val="center"/>
           </w:tcPr>
           <w:p>
             <w:pPr>
               <w:pStyle w:val="TableParagraph"/>
-              <w:spacing w:line="219" w:lineRule="exact"/>
+              <w:spacing w:before="240" w:after="240" w:line="219" w:lineRule="exact"/>
               <w:ind w:left="97"/>
-              <w:jc w:val="both"/>
               <w:rPr>
                 <w:color w:val="7E7E7E"/>
                 <w:sz w:val="18"/>
@@ -8731,7 +8958,7 @@
         </w:trPr>
         <w:tc>
           <w:tcPr>
-            <w:tcW w:w="743" w:type="dxa"/>
+            <w:tcW w:w="3132" w:type="dxa"/>
             <w:tcBorders>
               <w:top w:val="single" w:sz="8" w:space="0" w:color="7F7F7F" w:themeColor="text1" w:themeTint="80"/>
               <w:bottom w:val="single" w:sz="8" w:space="0" w:color="7F7F7F" w:themeColor="text1" w:themeTint="80"/>
@@ -8741,12 +8968,39 @@
           <w:p>
             <w:pPr>
               <w:pStyle w:val="Style30"/>
-            </w:pPr>
+              <w:numPr>
+                <w:ilvl w:val="0"/>
+                <w:numId w:val="0"/>
+              </w:numPr>
+            </w:pPr>
+            <w:r>
+              <w:rPr>
+                <w:rFonts w:cs="Segoe UI"/>
+                <w:sz w:val="20"/>
+              </w:rPr>
+              <w:t>{%</w:t>
+            </w:r>
+            <w:proofErr w:type="spellStart"/>
+            <w:r>
+              <w:rPr>
+                <w:rFonts w:cs="Segoe UI"/>
+                <w:sz w:val="20"/>
+              </w:rPr>
+              <w:t>tr</w:t>
+            </w:r>
+            <w:proofErr w:type="spellEnd"/>
+            <w:r>
+              <w:rPr>
+                <w:rFonts w:cs="Segoe UI"/>
+                <w:sz w:val="20"/>
+              </w:rPr>
+              <w:t xml:space="preserve"> endfor %}</w:t>
+            </w:r>
           </w:p>
         </w:tc>
         <w:tc>
           <w:tcPr>
-            <w:tcW w:w="1417" w:type="dxa"/>
+            <w:tcW w:w="2970" w:type="dxa"/>
             <w:tcBorders>
               <w:top w:val="single" w:sz="8" w:space="0" w:color="7F7F7F" w:themeColor="text1" w:themeTint="80"/>
               <w:left w:val="single" w:sz="8" w:space="0" w:color="7F7F7F" w:themeColor="text1" w:themeTint="80"/>
@@ -8763,55 +9017,11 @@
                 <w:sz w:val="18"/>
               </w:rPr>
             </w:pPr>
-            <w:r>
-              <w:rPr>
-                <w:rFonts w:cs="Segoe UI"/>
-                <w:sz w:val="20"/>
-                <w:szCs w:val="20"/>
-              </w:rPr>
-              <w:t>{%</w:t>
-            </w:r>
-            <w:proofErr w:type="spellStart"/>
-            <w:r>
-              <w:rPr>
-                <w:rFonts w:cs="Segoe UI"/>
-                <w:sz w:val="20"/>
-                <w:szCs w:val="20"/>
-              </w:rPr>
-              <w:t>tr</w:t>
-            </w:r>
-            <w:proofErr w:type="spellEnd"/>
-            <w:r>
-              <w:rPr>
-                <w:rFonts w:cs="Segoe UI"/>
-                <w:sz w:val="20"/>
-                <w:szCs w:val="20"/>
-              </w:rPr>
-              <w:t xml:space="preserve"> </w:t>
-            </w:r>
-            <w:proofErr w:type="spellStart"/>
-            <w:r>
-              <w:rPr>
-                <w:rFonts w:cs="Segoe UI"/>
-                <w:sz w:val="20"/>
-                <w:szCs w:val="20"/>
-              </w:rPr>
-              <w:t>endfor</w:t>
-            </w:r>
-            <w:proofErr w:type="spellEnd"/>
-            <w:r>
-              <w:rPr>
-                <w:rFonts w:cs="Segoe UI"/>
-                <w:sz w:val="20"/>
-                <w:szCs w:val="20"/>
-              </w:rPr>
-              <w:t xml:space="preserve"> %}</w:t>
-            </w:r>
           </w:p>
         </w:tc>
         <w:tc>
           <w:tcPr>
-            <w:tcW w:w="7168" w:type="dxa"/>
+            <w:tcW w:w="3600" w:type="dxa"/>
             <w:tcBorders>
               <w:top w:val="single" w:sz="8" w:space="0" w:color="7F7F7F" w:themeColor="text1" w:themeTint="80"/>
               <w:left w:val="single" w:sz="8" w:space="0" w:color="7F7F7F" w:themeColor="text1" w:themeTint="80"/>
@@ -10934,27 +11144,7 @@
               <w:sz w:val="20"/>
               <w:szCs w:val="20"/>
             </w:rPr>
-            <w:t>{{</w:t>
-          </w:r>
-          <w:proofErr w:type="spellStart"/>
-          <w:r>
-            <w:rPr>
-              <w:b/>
-              <w:bCs/>
-              <w:sz w:val="20"/>
-              <w:szCs w:val="20"/>
-            </w:rPr>
-            <w:t>codigoBot</w:t>
-          </w:r>
-          <w:proofErr w:type="spellEnd"/>
-          <w:r>
-            <w:rPr>
-              <w:b/>
-              <w:bCs/>
-              <w:sz w:val="20"/>
-              <w:szCs w:val="20"/>
-            </w:rPr>
-            <w:t>}}</w:t>
+            <w:t>{{codigoBot}}</w:t>
           </w:r>
           <w:r>
             <w:rPr>
@@ -16462,6 +16652,9 @@
   </w:num>
   <w:num w:numId="50" w16cid:durableId="583414719">
     <w:abstractNumId w:val="13"/>
+  </w:num>
+  <w:num w:numId="51" w16cid:durableId="916131864">
+    <w:abstractNumId w:val="43"/>
   </w:num>
   <w:numIdMacAtCleanup w:val="15"/>
 </w:numbering>
@@ -16859,7 +17052,7 @@
   <w:style w:type="paragraph" w:default="1" w:styleId="Normal">
     <w:name w:val="Normal"/>
     <w:qFormat/>
-    <w:rsid w:val="004A053F"/>
+    <w:rsid w:val="00206F10"/>
     <w:pPr>
       <w:spacing w:before="120"/>
       <w:jc w:val="both"/>
@@ -19490,7 +19683,7 @@
     <w:qFormat/>
     <w:rsid w:val="001A7AB0"/>
     <w:pPr>
-      <w:ind w:left="726"/>
+      <w:ind w:left="1435"/>
     </w:pPr>
   </w:style>
   <w:style w:type="character" w:customStyle="1" w:styleId="Style3Char">
@@ -19987,78 +20180,6 @@
 </file>
 
 <file path=customXml/item2.xml><?xml version="1.0" encoding="utf-8"?>
-<p:properties xmlns:p="http://schemas.microsoft.com/office/2006/metadata/properties" xmlns:xsi="http://www.w3.org/2001/XMLSchema-instance" xmlns:pc="http://schemas.microsoft.com/office/infopath/2007/PartnerControls">
-  <documentManagement>
-    <SharedWithUsers xmlns="e692d05a-8f3f-4f3c-9f7a-297d33913966">
-      <UserInfo>
-        <DisplayName>Federico Damian Medina</DisplayName>
-        <AccountId>2357</AccountId>
-        <AccountType/>
-      </UserInfo>
-      <UserInfo>
-        <DisplayName>Adrián García</DisplayName>
-        <AccountId>2347</AccountId>
-        <AccountType/>
-      </UserInfo>
-      <UserInfo>
-        <DisplayName>Nicolas Roberto Yapura Olivera</DisplayName>
-        <AccountId>2348</AccountId>
-        <AccountType/>
-      </UserInfo>
-      <UserInfo>
-        <DisplayName>Gabriel Ocampo</DisplayName>
-        <AccountId>21</AccountId>
-        <AccountType/>
-      </UserInfo>
-      <UserInfo>
-        <DisplayName>Gabriela Tornati</DisplayName>
-        <AccountId>18</AccountId>
-        <AccountType/>
-      </UserInfo>
-      <UserInfo>
-        <DisplayName>Johan Malave Gomez</DisplayName>
-        <AccountId>3303</AccountId>
-        <AccountType/>
-      </UserInfo>
-      <UserInfo>
-        <DisplayName>David Garcia</DisplayName>
-        <AccountId>3305</AccountId>
-        <AccountType/>
-      </UserInfo>
-      <UserInfo>
-        <DisplayName>Maria Soledad Martinez</DisplayName>
-        <AccountId>3994</AccountId>
-        <AccountType/>
-      </UserInfo>
-      <UserInfo>
-        <DisplayName>Seoane, Maria Laura (A-id)</DisplayName>
-        <AccountId>2383</AccountId>
-        <AccountType/>
-      </UserInfo>
-      <UserInfo>
-        <DisplayName>Juliana Comunelli</DisplayName>
-        <AccountId>4193</AccountId>
-        <AccountType/>
-      </UserInfo>
-      <UserInfo>
-        <DisplayName>Pelle, Maria Celeste (A-id)</DisplayName>
-        <AccountId>2387</AccountId>
-        <AccountType/>
-      </UserInfo>
-    </SharedWithUsers>
-    <MediaLengthInSeconds xmlns="7c9733af-7a48-497e-be4f-98a48d8b296c" xsi:nil="true"/>
-    <Progress_x0020__x0025_ xmlns="126aced9-e92e-431b-8860-19f9000349a9" xsi:nil="true"/>
-    <lcf76f155ced4ddcb4097134ff3c332f xmlns="7c9733af-7a48-497e-be4f-98a48d8b296c">
-      <Terms xmlns="http://schemas.microsoft.com/office/infopath/2007/PartnerControls"/>
-    </lcf76f155ced4ddcb4097134ff3c332f>
-    <TaxCatchAll xmlns="126aced9-e92e-431b-8860-19f9000349a9" xsi:nil="true"/>
-    <Target_x0020_Date xmlns="126aced9-e92e-431b-8860-19f9000349a9" xsi:nil="true"/>
-    <Document_x0020_Type xmlns="126aced9-e92e-431b-8860-19f9000349a9">Choose Document Type…</Document_x0020_Type>
-  </documentManagement>
-</p:properties>
-</file>
-
-<file path=customXml/item3.xml><?xml version="1.0" encoding="utf-8"?>
 <ct:contentTypeSchema xmlns:ct="http://schemas.microsoft.com/office/2006/metadata/contentType" xmlns:ma="http://schemas.microsoft.com/office/2006/metadata/properties/metaAttributes" ct:_="" ma:_="" ma:contentTypeName="Document" ma:contentTypeID="0x0101003E5E40AF5AAB644388956D1EDB5811C4" ma:contentTypeVersion="" ma:contentTypeDescription="Create a new document." ma:contentTypeScope="" ma:versionID="eb9d285613b0b7fd252419e165da78ff">
   <xsd:schema xmlns:xsd="http://www.w3.org/2001/XMLSchema" xmlns:xs="http://www.w3.org/2001/XMLSchema" xmlns:p="http://schemas.microsoft.com/office/2006/metadata/properties" xmlns:ns2="126aced9-e92e-431b-8860-19f9000349a9" xmlns:ns3="7c9733af-7a48-497e-be4f-98a48d8b296c" xmlns:ns4="e692d05a-8f3f-4f3c-9f7a-297d33913966" targetNamespace="http://schemas.microsoft.com/office/2006/metadata/properties" ma:root="true" ma:fieldsID="5804f93a32e9328b48f081a9ad710d90" ns2:_="" ns3:_="" ns4:_="">
     <xsd:import namespace="126aced9-e92e-431b-8860-19f9000349a9"/>
@@ -20331,7 +20452,7 @@
 </ct:contentTypeSchema>
 </file>
 
-<file path=customXml/item4.xml><?xml version="1.0" encoding="utf-8"?>
+<file path=customXml/item3.xml><?xml version="1.0" encoding="utf-8"?>
 <?mso-contentType ?>
 <FormTemplates xmlns="http://schemas.microsoft.com/sharepoint/v3/contenttype/forms">
   <Display>DocumentLibraryForm</Display>
@@ -20340,8 +20461,80 @@
 </FormTemplates>
 </file>
 
+<file path=customXml/item4.xml><?xml version="1.0" encoding="utf-8"?>
+<b:Sources xmlns:b="http://schemas.openxmlformats.org/officeDocument/2006/bibliography" xmlns="http://schemas.openxmlformats.org/officeDocument/2006/bibliography" SelectedStyle="\APA.XSL" StyleName="APA"/>
+</file>
+
 <file path=customXml/item5.xml><?xml version="1.0" encoding="utf-8"?>
-<b:Sources xmlns:b="http://schemas.openxmlformats.org/officeDocument/2006/bibliography" xmlns="http://schemas.openxmlformats.org/officeDocument/2006/bibliography" SelectedStyle="\APA.XSL" StyleName="APA"/>
+<p:properties xmlns:p="http://schemas.microsoft.com/office/2006/metadata/properties" xmlns:xsi="http://www.w3.org/2001/XMLSchema-instance" xmlns:pc="http://schemas.microsoft.com/office/infopath/2007/PartnerControls">
+  <documentManagement>
+    <SharedWithUsers xmlns="e692d05a-8f3f-4f3c-9f7a-297d33913966">
+      <UserInfo>
+        <DisplayName>Federico Damian Medina</DisplayName>
+        <AccountId>2357</AccountId>
+        <AccountType/>
+      </UserInfo>
+      <UserInfo>
+        <DisplayName>Adrián García</DisplayName>
+        <AccountId>2347</AccountId>
+        <AccountType/>
+      </UserInfo>
+      <UserInfo>
+        <DisplayName>Nicolas Roberto Yapura Olivera</DisplayName>
+        <AccountId>2348</AccountId>
+        <AccountType/>
+      </UserInfo>
+      <UserInfo>
+        <DisplayName>Gabriel Ocampo</DisplayName>
+        <AccountId>21</AccountId>
+        <AccountType/>
+      </UserInfo>
+      <UserInfo>
+        <DisplayName>Gabriela Tornati</DisplayName>
+        <AccountId>18</AccountId>
+        <AccountType/>
+      </UserInfo>
+      <UserInfo>
+        <DisplayName>Johan Malave Gomez</DisplayName>
+        <AccountId>3303</AccountId>
+        <AccountType/>
+      </UserInfo>
+      <UserInfo>
+        <DisplayName>David Garcia</DisplayName>
+        <AccountId>3305</AccountId>
+        <AccountType/>
+      </UserInfo>
+      <UserInfo>
+        <DisplayName>Maria Soledad Martinez</DisplayName>
+        <AccountId>3994</AccountId>
+        <AccountType/>
+      </UserInfo>
+      <UserInfo>
+        <DisplayName>Seoane, Maria Laura (A-id)</DisplayName>
+        <AccountId>2383</AccountId>
+        <AccountType/>
+      </UserInfo>
+      <UserInfo>
+        <DisplayName>Juliana Comunelli</DisplayName>
+        <AccountId>4193</AccountId>
+        <AccountType/>
+      </UserInfo>
+      <UserInfo>
+        <DisplayName>Pelle, Maria Celeste (A-id)</DisplayName>
+        <AccountId>2387</AccountId>
+        <AccountType/>
+      </UserInfo>
+    </SharedWithUsers>
+    <MediaLengthInSeconds xmlns="7c9733af-7a48-497e-be4f-98a48d8b296c" xsi:nil="true"/>
+    <Progress_x0020__x0025_ xmlns="126aced9-e92e-431b-8860-19f9000349a9" xsi:nil="true"/>
+    <lcf76f155ced4ddcb4097134ff3c332f xmlns="7c9733af-7a48-497e-be4f-98a48d8b296c">
+      <Terms xmlns="http://schemas.microsoft.com/office/infopath/2007/PartnerControls"/>
+    </lcf76f155ced4ddcb4097134ff3c332f>
+    <TaxCatchAll xmlns="126aced9-e92e-431b-8860-19f9000349a9" xsi:nil="true"/>
+    <Target_x0020_Date xmlns="126aced9-e92e-431b-8860-19f9000349a9" xsi:nil="true"/>
+    <Document_x0020_Type xmlns="126aced9-e92e-431b-8860-19f9000349a9">Choose Document Type…</Document_x0020_Type>
+  </documentManagement>
+</p:properties>
 </file>
 
 <file path=customXml/itemProps1.xml><?xml version="1.0" encoding="utf-8"?>
@@ -20353,18 +20546,6 @@
 </file>
 
 <file path=customXml/itemProps2.xml><?xml version="1.0" encoding="utf-8"?>
-<ds:datastoreItem xmlns:ds="http://schemas.openxmlformats.org/officeDocument/2006/customXml" ds:itemID="{ED4A838A-6700-4746-8E85-0AE11B429EB7}">
-  <ds:schemaRefs>
-    <ds:schemaRef ds:uri="http://schemas.microsoft.com/office/2006/metadata/properties"/>
-    <ds:schemaRef ds:uri="http://schemas.microsoft.com/office/infopath/2007/PartnerControls"/>
-    <ds:schemaRef ds:uri="e692d05a-8f3f-4f3c-9f7a-297d33913966"/>
-    <ds:schemaRef ds:uri="7c9733af-7a48-497e-be4f-98a48d8b296c"/>
-    <ds:schemaRef ds:uri="126aced9-e92e-431b-8860-19f9000349a9"/>
-  </ds:schemaRefs>
-</ds:datastoreItem>
-</file>
-
-<file path=customXml/itemProps3.xml><?xml version="1.0" encoding="utf-8"?>
 <ds:datastoreItem xmlns:ds="http://schemas.openxmlformats.org/officeDocument/2006/customXml" ds:itemID="{7FA7E414-AF2B-4FB6-9A7F-3A449009958A}">
   <ds:schemaRefs>
     <ds:schemaRef ds:uri="http://schemas.microsoft.com/office/2006/metadata/contentType"/>
@@ -20384,7 +20565,7 @@
 </ds:datastoreItem>
 </file>
 
-<file path=customXml/itemProps4.xml><?xml version="1.0" encoding="utf-8"?>
+<file path=customXml/itemProps3.xml><?xml version="1.0" encoding="utf-8"?>
 <ds:datastoreItem xmlns:ds="http://schemas.openxmlformats.org/officeDocument/2006/customXml" ds:itemID="{C2E9D9F7-1128-4CE9-A3D9-F2E0BE8A9904}">
   <ds:schemaRefs>
     <ds:schemaRef ds:uri="http://schemas.microsoft.com/sharepoint/v3/contenttype/forms"/>
@@ -20392,10 +20573,22 @@
 </ds:datastoreItem>
 </file>
 
-<file path=customXml/itemProps5.xml><?xml version="1.0" encoding="utf-8"?>
+<file path=customXml/itemProps4.xml><?xml version="1.0" encoding="utf-8"?>
 <ds:datastoreItem xmlns:ds="http://schemas.openxmlformats.org/officeDocument/2006/customXml" ds:itemID="{960B7B98-C93C-45CA-ADCD-07AEDD7280FD}">
   <ds:schemaRefs>
     <ds:schemaRef ds:uri="http://schemas.openxmlformats.org/officeDocument/2006/bibliography"/>
+  </ds:schemaRefs>
+</ds:datastoreItem>
+</file>
+
+<file path=customXml/itemProps5.xml><?xml version="1.0" encoding="utf-8"?>
+<ds:datastoreItem xmlns:ds="http://schemas.openxmlformats.org/officeDocument/2006/customXml" ds:itemID="{ED4A838A-6700-4746-8E85-0AE11B429EB7}">
+  <ds:schemaRefs>
+    <ds:schemaRef ds:uri="http://schemas.microsoft.com/office/2006/metadata/properties"/>
+    <ds:schemaRef ds:uri="http://schemas.microsoft.com/office/infopath/2007/PartnerControls"/>
+    <ds:schemaRef ds:uri="e692d05a-8f3f-4f3c-9f7a-297d33913966"/>
+    <ds:schemaRef ds:uri="7c9733af-7a48-497e-be4f-98a48d8b296c"/>
+    <ds:schemaRef ds:uri="126aced9-e92e-431b-8860-19f9000349a9"/>
   </ds:schemaRefs>
 </ds:datastoreItem>
 </file>

</xml_diff>